<commit_message>
Fix hardware, firmware, and documentation bugs from the first audit rounds
</commit_message>
<xml_diff>
--- a/paper/submission/paper.docx
+++ b/paper/submission/paper.docx
@@ -26,7 +26,7 @@
         <w:t xml:space="preserve">August 23, 2026</w:t>
       </w:r>
     </w:p>
-    <w:bookmarkStart w:id="9" w:name="sec:abstract"/>
+    <w:bookmarkStart w:id="20" w:name="sec:abstract"/>
     <w:p>
       <w:pPr>
         <w:pStyle w:val="Heading1"/>
@@ -69,8 +69,8 @@
         <w:t xml:space="preserve">Keywords: Processing-Near-Memory; Wormhole Switching; Deterministic Routing; Dimension-Order Routing; Spatial Computing; LPDDR6 CAMM2; DUV ASIC; Mixture-of-Experts Transformers; Stencil Computation; Roofline Analysis; RISC-V; BMC; High-Performance Computing</w:t>
       </w:r>
     </w:p>
-    <w:bookmarkEnd w:id="9"/>
-    <w:bookmarkStart w:id="14" w:name="sec:introduction"/>
+    <w:bookmarkEnd w:id="20"/>
+    <w:bookmarkStart w:id="25" w:name="sec:introduction"/>
     <w:p>
       <w:pPr>
         <w:pStyle w:val="Heading1"/>
@@ -79,7 +79,7 @@
         <w:t xml:space="preserve">Introduction</w:t>
       </w:r>
     </w:p>
-    <w:bookmarkStart w:id="10" w:name="sec:1.1"/>
+    <w:bookmarkStart w:id="21" w:name="sec:1.1"/>
     <w:p>
       <w:pPr>
         <w:pStyle w:val="Heading2"/>
@@ -134,8 +134,8 @@
         <w:t xml:space="preserve">—each a standard JEDEC part with no interposer dependency, no advanced lithography requirement, and a thermal envelope of approximately 5 W—paired with a mature-node 14 nm or 28 nm DUV MAC ASIC. The Results section quantifies the alternative: a 512-node chassis provides 64 TB at approximately 15 W per node and approximately 8–10 kW per chassis, versus 0.6 MW and 819 GPUs for capacity-equivalent HBM.</w:t>
       </w:r>
     </w:p>
-    <w:bookmarkEnd w:id="10"/>
-    <w:bookmarkStart w:id="11" w:name="sec:1.2"/>
+    <w:bookmarkEnd w:id="21"/>
+    <w:bookmarkStart w:id="22" w:name="sec:1.2"/>
     <w:p>
       <w:pPr>
         <w:pStyle w:val="Heading2"/>
@@ -209,8 +209,8 @@
         <w:t xml:space="preserve">) possible at all.</w:t>
       </w:r>
     </w:p>
-    <w:bookmarkEnd w:id="11"/>
-    <w:bookmarkStart w:id="12" w:name="sec:1.3"/>
+    <w:bookmarkEnd w:id="22"/>
+    <w:bookmarkStart w:id="23" w:name="sec:1.3"/>
     <w:p>
       <w:pPr>
         <w:pStyle w:val="Heading2"/>
@@ -253,8 +253,8 @@
         <w:t xml:space="preserve">—further illustrates the fragility of an ecosystem built on interposer-bound, EUV-dependent memory. By pairing commodity LPDDR6 CAMM2 modules with mature-node logic, the architecture decouples memory capacity from the interposer and lithography bottlenecks that constrain HBM.</w:t>
       </w:r>
     </w:p>
-    <w:bookmarkEnd w:id="12"/>
-    <w:bookmarkStart w:id="13" w:name="sec:1.4"/>
+    <w:bookmarkEnd w:id="23"/>
+    <w:bookmarkStart w:id="24" w:name="sec:1.4"/>
     <w:p>
       <w:pPr>
         <w:pStyle w:val="Heading2"/>
@@ -294,9 +294,9 @@
         <w:t xml:space="preserve">).</w:t>
       </w:r>
     </w:p>
-    <w:bookmarkEnd w:id="13"/>
-    <w:bookmarkEnd w:id="14"/>
-    <w:bookmarkStart w:id="37" w:name="sec:methods"/>
+    <w:bookmarkEnd w:id="24"/>
+    <w:bookmarkEnd w:id="25"/>
+    <w:bookmarkStart w:id="48" w:name="sec:methods"/>
     <w:p>
       <w:pPr>
         <w:pStyle w:val="Heading1"/>
@@ -305,7 +305,7 @@
         <w:t xml:space="preserve">Methods</w:t>
       </w:r>
     </w:p>
-    <w:bookmarkStart w:id="15" w:name="sec:2.1"/>
+    <w:bookmarkStart w:id="26" w:name="sec:2.1"/>
     <w:p>
       <w:pPr>
         <w:pStyle w:val="Heading2"/>
@@ -701,8 +701,8 @@
         <w:t xml:space="preserve">), and injects every JIT-dispatched token into the fabric. Everything on the hot path is pure transport; everything with state lives in a single chip at the spine root.</w:t>
       </w:r>
     </w:p>
-    <w:bookmarkEnd w:id="15"/>
-    <w:bookmarkStart w:id="16" w:name="sec:2.2"/>
+    <w:bookmarkEnd w:id="26"/>
+    <w:bookmarkStart w:id="27" w:name="sec:2.2"/>
     <w:p>
       <w:pPr>
         <w:pStyle w:val="Heading2"/>
@@ -789,8 +789,8 @@
         <w:t xml:space="preserve">is a sum of node-local bandwidths, and any workload that must move data between nodes is fabric-bound at the link rate.</w:t>
       </w:r>
     </w:p>
-    <w:bookmarkEnd w:id="16"/>
-    <w:bookmarkStart w:id="17" w:name="sec:2.3"/>
+    <w:bookmarkEnd w:id="27"/>
+    <w:bookmarkStart w:id="28" w:name="sec:2.3"/>
     <w:p>
       <w:pPr>
         <w:pStyle w:val="Heading2"/>
@@ -955,8 +955,8 @@
         <w:t xml:space="preserve">C below the throttling threshold.</w:t>
       </w:r>
     </w:p>
-    <w:bookmarkEnd w:id="17"/>
-    <w:bookmarkStart w:id="18" w:name="sec:2.4"/>
+    <w:bookmarkEnd w:id="28"/>
+    <w:bookmarkStart w:id="29" w:name="sec:2.4"/>
     <w:p>
       <w:pPr>
         <w:pStyle w:val="Heading2"/>
@@ -1382,8 +1382,8 @@
         <w:t xml:space="preserve">20 mm on dedicated DDR routing layers as a tightly matched bundle—the shortest legal memory route on the board. The fabric links are point-to-point HFR-to-HFR runs on their own layers, driven source-synchronously: the clock is forwarded beside the data, so per-link skew is absorbed by the receive FIFO and the wire delay is the single deterministic term the compiler’s closed form uses. A 64-node board is estimated at 10–12 routing layers: two DDR escape planes, two fabric planes, a spine-breakout region, and power/ground planes between them. The four sideband signals share one low-speed daisy-chain trace pair climbing the spine to the central router chip; their single-wire-per-signal cost is the entire control-plane wiring budget of the design.</w:t>
       </w:r>
     </w:p>
-    <w:bookmarkEnd w:id="18"/>
-    <w:bookmarkStart w:id="19" w:name="sec:2.5"/>
+    <w:bookmarkEnd w:id="29"/>
+    <w:bookmarkStart w:id="30" w:name="sec:2.5"/>
     <w:p>
       <w:pPr>
         <w:pStyle w:val="Heading2"/>
@@ -2039,8 +2039,8 @@
         <w:t xml:space="preserve">).</w:t>
       </w:r>
     </w:p>
-    <w:bookmarkEnd w:id="19"/>
-    <w:bookmarkStart w:id="20" w:name="sec:2.6"/>
+    <w:bookmarkEnd w:id="30"/>
+    <w:bookmarkStart w:id="31" w:name="sec:2.6"/>
     <w:p>
       <w:pPr>
         <w:pStyle w:val="Heading2"/>
@@ -2153,8 +2153,8 @@
         <w:t xml:space="preserve">), not by instruction fetch. The MAC array reads weights from the local bank at the full 256 GB/s bus rate, executes the resident kernel, and returns the result through the fabric. There are no runtime page faults, no TLB misses, no cache coherence invalidations, and no operating-system context switches. The hardware is a physical dataflow graph; the software is the static assignment of that graph to silicon.</w:t>
       </w:r>
     </w:p>
-    <w:bookmarkEnd w:id="20"/>
-    <w:bookmarkStart w:id="21" w:name="sec:2.7"/>
+    <w:bookmarkEnd w:id="31"/>
+    <w:bookmarkStart w:id="32" w:name="sec:2.7"/>
     <w:p>
       <w:pPr>
         <w:pStyle w:val="Heading2"/>
@@ -5857,8 +5857,8 @@
         <w:t xml:space="preserve">) sound. The compiler’s kernel mapping is a many-to-one function—many tensor operations map to the same kernel type, differing only in their weight dimensions—and the hardware executes them all identically.</w:t>
       </w:r>
     </w:p>
-    <w:bookmarkEnd w:id="21"/>
-    <w:bookmarkStart w:id="22" w:name="sec:2.8"/>
+    <w:bookmarkEnd w:id="32"/>
+    <w:bookmarkStart w:id="33" w:name="sec:2.8"/>
     <w:p>
       <w:pPr>
         <w:pStyle w:val="Heading2"/>
@@ -6179,8 +6179,8 @@
         <w:t xml:space="preserve">tokens/s depending on expert placement—comparable to what 131 TB/s of node-local memory can serve, and far below the router’s raw decision capacity. Optional per-layer dispatch replicas scale the decision rate linearly and remain deterministic because the routing function is pure; they do not raise the fabric-bound ceiling.</w:t>
       </w:r>
     </w:p>
-    <w:bookmarkEnd w:id="22"/>
-    <w:bookmarkStart w:id="23" w:name="sec:2.9"/>
+    <w:bookmarkEnd w:id="33"/>
+    <w:bookmarkStart w:id="34" w:name="sec:2.9"/>
     <w:p>
       <w:pPr>
         <w:pStyle w:val="Heading2"/>
@@ -6216,7 +6216,7 @@
         <w:pStyle w:val="BodyText"/>
       </w:pPr>
       <w:r>
-        <w:t xml:space="preserve">The hardware fabric decouples transport from computation. The deterministic repeater network connects to a modular Processing Element (PE) interface via standard AXI-Stream / Ready-Valid handshaking, allowing the underlying execution block (systolic array, FP16 MAC array, or ALU) to be swapped independently of the routing fabric. The companion PE tile stub in the HDL sketch (HDL/pe_tile_stub.v) implements this contract: it consumes a flit on its slave port, holds it for one to two clock cycles to model multiply-accumulate latency, and re-presents it on the master port, so the transport-level verification of Sections</w:t>
+        <w:t xml:space="preserve">The hardware fabric decouples transport from computation. The deterministic repeater network connects to a modular Processing Element (PE) interface via standard AXI-Stream / Ready-Valid handshaking, allowing the underlying execution block (systolic array, FP16 MAC array, or ALU) to be swapped independently of the routing fabric. The companion PE tile stub in the HDL sketch (HDL/core/pe_tile_stub.v) implements this contract: it consumes a flit on its slave port, holds it for one to two clock cycles to model multiply-accumulate latency, and re-presents it on the master port, so the transport-level verification of Sections</w:t>
       </w:r>
       <w:r>
         <w:t xml:space="preserve"> </w:t>
@@ -6343,8 +6343,8 @@
         <w:t xml:space="preserve">).</w:t>
       </w:r>
     </w:p>
-    <w:bookmarkEnd w:id="23"/>
-    <w:bookmarkStart w:id="24" w:name="sec:2.10"/>
+    <w:bookmarkEnd w:id="34"/>
+    <w:bookmarkStart w:id="35" w:name="sec:2.10"/>
     <w:p>
       <w:pPr>
         <w:pStyle w:val="Heading2"/>
@@ -6428,8 +6428,8 @@
         <w:t xml:space="preserve">) re-runs the work on a healthy replica; that is functional recomputation under the same doorbell discipline, not bit-exact replay of the failed node’s memory contents. The machine guarantees determinism of the fabric and of computation given a memory snapshot; soft errors in memory are handled statistically by scrub and retry, not claimed away.</w:t>
       </w:r>
     </w:p>
-    <w:bookmarkEnd w:id="24"/>
-    <w:bookmarkStart w:id="27" w:name="sec:2.11"/>
+    <w:bookmarkEnd w:id="35"/>
+    <w:bookmarkStart w:id="38" w:name="sec:2.11"/>
     <w:p>
       <w:pPr>
         <w:pStyle w:val="Heading2"/>
@@ -6438,7 +6438,7 @@
         <w:t xml:space="preserve">2.11 Target Workloads</w:t>
       </w:r>
     </w:p>
-    <w:bookmarkStart w:id="25" w:name="sec:2.11.1"/>
+    <w:bookmarkStart w:id="36" w:name="sec:2.11.1"/>
     <w:p>
       <w:pPr>
         <w:pStyle w:val="Heading3"/>
@@ -6747,8 +6747,8 @@
         <w:t xml:space="preserve">All five pass the full verification suite (byte-exact delivery, doorbell accounting, kernel correctness, latency bounds) on the default chassis.</w:t>
       </w:r>
     </w:p>
-    <w:bookmarkEnd w:id="25"/>
-    <w:bookmarkStart w:id="26" w:name="sec:2.11.2"/>
+    <w:bookmarkEnd w:id="36"/>
+    <w:bookmarkStart w:id="37" w:name="sec:2.11.2"/>
     <w:p>
       <w:pPr>
         <w:pStyle w:val="Heading3"/>
@@ -6847,9 +6847,9 @@
         <w:t xml:space="preserve">The compiler selects among these patterns during its route-planning stage: it computes each message’s source-destination pair, checks whether the pair shares a layer (dimension-order suffices), and otherwise inserts spine hops into the source-routed header. No runtime routing decisions exist in the fabric itself—every flit carries its complete route from the moment of injection.</w:t>
       </w:r>
     </w:p>
-    <w:bookmarkEnd w:id="26"/>
-    <w:bookmarkEnd w:id="27"/>
-    <w:bookmarkStart w:id="28" w:name="sec:2.12"/>
+    <w:bookmarkEnd w:id="37"/>
+    <w:bookmarkEnd w:id="38"/>
+    <w:bookmarkStart w:id="39" w:name="sec:2.12"/>
     <w:p>
       <w:pPr>
         <w:pStyle w:val="Heading2"/>
@@ -7114,8 +7114,8 @@
         <w:t xml:space="preserve">For interactive inference (chat, code generation, retrieval-augmented generation), the architecture includes an LLM inference client that handles tokenization, prefill, autoregressive generation, and temperature/nucleus sampling. The client boots the firmware, builds a vocabulary from the model’s tokenizer configuration, and generates tokens one at a time: each token triggers a prefill phase (all layers, all experts) followed by an autoregressive phase (cached KV state, reduced compute). The sampling pipeline computes softmax over the logit vector with numerical stability (max-subtraction trick), applies temperature scaling, sorts by probability, and selects via nucleus (top-p) sampling, all running on the host with the results dispatched to the chassis as token directives. The client tracks per-inference statistics—tokens generated, prefill tokens, total dispatches, MoE and dense dispatches, KV store/load/eviction operations—and reports compute unit utilization across the chassis. Token encoding on the wire varies by data type: 2 bytes for BF16 and FP16, 4 bytes for FP32, and 8 bytes for FP64.</w:t>
       </w:r>
     </w:p>
-    <w:bookmarkEnd w:id="28"/>
-    <w:bookmarkStart w:id="29" w:name="sec:2.13"/>
+    <w:bookmarkEnd w:id="39"/>
+    <w:bookmarkStart w:id="40" w:name="sec:2.13"/>
     <w:p>
       <w:pPr>
         <w:pStyle w:val="Heading2"/>
@@ -7180,8 +7180,8 @@
         <w:t xml:space="preserve">).</w:t>
       </w:r>
     </w:p>
-    <w:bookmarkEnd w:id="29"/>
-    <w:bookmarkStart w:id="30" w:name="sec:2.14"/>
+    <w:bookmarkEnd w:id="40"/>
+    <w:bookmarkStart w:id="41" w:name="sec:2.14"/>
     <w:p>
       <w:pPr>
         <w:pStyle w:val="Heading2"/>
@@ -7235,8 +7235,8 @@
         <w:t xml:space="preserve">hold.</w:t>
       </w:r>
     </w:p>
-    <w:bookmarkEnd w:id="30"/>
-    <w:bookmarkStart w:id="31" w:name="sec:2.15"/>
+    <w:bookmarkEnd w:id="41"/>
+    <w:bookmarkStart w:id="42" w:name="sec:2.15"/>
     <w:p>
       <w:pPr>
         <w:pStyle w:val="Heading2"/>
@@ -7530,8 +7530,8 @@
         <w:t xml:space="preserve">assigns it statically). Each slice’s testbench injects from a stimulus file, applies per-node backpressure (each DMA sink accepts one byte in N cycles, N fixed per scenario), and terminates adaptively: it finishes 200 cycles after the last transition on any fabric wire, with a watchdog at 64 times the injected byte count for pathological stalls.</w:t>
       </w:r>
     </w:p>
-    <w:bookmarkEnd w:id="31"/>
-    <w:bookmarkStart w:id="32" w:name="sec:2.16"/>
+    <w:bookmarkEnd w:id="42"/>
+    <w:bookmarkStart w:id="43" w:name="sec:2.16"/>
     <w:p>
       <w:pPr>
         <w:pStyle w:val="Heading2"/>
@@ -7876,8 +7876,44 @@
         <w:t xml:space="preserve">—not claimed away.</w:t>
       </w:r>
     </w:p>
-    <w:bookmarkEnd w:id="32"/>
-    <w:bookmarkStart w:id="34" w:name="sec:2.17"/>
+    <w:p>
+      <w:pPr>
+        <w:pStyle w:val="BodyText"/>
+      </w:pPr>
+      <w:r>
+        <w:t xml:space="preserve">Generation portability. The controller’s bus contract—valid/ready acceptance, CAS-latency wait, one response per transaction—is deliberately the only interface its consumers see, which makes it portable across DRAM generations. Three behavioral PHY variants in the repository pin this down: an LPDDR5 profile (four banks, CAS 16, tRCD 4, tRP 3, tRAS 8, 3.9</w:t>
+      </w:r>
+      <w:r>
+        <w:t xml:space="preserve"> </w:t>
+      </w:r>
+      <m:oMath>
+        <m:r>
+          <m:t>μ</m:t>
+        </m:r>
+      </m:oMath>
+      <w:r>
+        <w:t xml:space="preserve">s refresh), an LPDDR5X profile (CAS 14, tRCD 3, tRP 2, tRAS 7), and the flagship LPDDR6 flat-bank profile (CAS 4). Each is exercised by a self-checking testbench that polls the ready strobe rather than assuming fixed delays (tb_lpddr5_phy.v, tb_lpddr5x_phy.v, tb_lpddr6_phy.v). A deployment selects the module class by synthesis-time parameter; the MAC array, doorbell DMA, and firmware are untouched—the same generation-agnostic claim Section</w:t>
+      </w:r>
+      <w:r>
+        <w:t xml:space="preserve"> </w:t>
+      </w:r>
+      <w:hyperlink w:anchor="sec:3.7">
+        <w:r>
+          <w:rPr>
+            <w:rStyle w:val="Hyperlink"/>
+          </w:rPr>
+          <w:t xml:space="preserve">3.7</w:t>
+        </w:r>
+      </w:hyperlink>
+      <w:r>
+        <w:t xml:space="preserve"> </w:t>
+      </w:r>
+      <w:r>
+        <w:t xml:space="preserve">machine-checks for SODIMM classes, extended to the LPDDR5/5X/6 CAMM2 ladder.</w:t>
+      </w:r>
+    </w:p>
+    <w:bookmarkEnd w:id="43"/>
+    <w:bookmarkStart w:id="45" w:name="sec:2.17"/>
     <w:p>
       <w:pPr>
         <w:pStyle w:val="Heading2"/>
@@ -7984,7 +8020,7 @@
         <w:t xml:space="preserve">The current RTL implements the RV32IMA baseline as a proof of concept; production silicon upgrades to RV32IMAFC (adding compressed instructions and single/double-precision floating point) to meet the NOMMU Linux requirement. The C firmware port targets both deployment modes: bare-metal static allocation for deterministic boot-time behavior, and a NOMMU Linux userspace daemon for operational flexibility.</w:t>
       </w:r>
     </w:p>
-    <w:bookmarkStart w:id="33" w:name="sec:2.17.1"/>
+    <w:bookmarkStart w:id="44" w:name="sec:2.17.1"/>
     <w:p>
       <w:pPr>
         <w:pStyle w:val="Heading3"/>
@@ -8058,6 +8094,73 @@
         <w:pStyle w:val="BodyText"/>
       </w:pPr>
       <w:r>
+        <w:t xml:space="preserve">The RTL ships four SoC tiers sharing the CPU and bus fabric, so a deployment scales the management plane without changing firmware structure above the register layer. The BMC tier (bmc_router_top.v) is the five-region minimal map above. The MCU tier (router_mcu.v) drops the CLINT for pure bare-metal dispatch loops. The MoE SBC tier (router_sbc_moe.v) adds a 64 KB BF16 gating SRAM, an on-chip systolic array, and the moe_gating unit so expert selection runs in silicon next to the dispatcher. The general SBC tier (router_sbc.v) is the full machine: SRAM at 0x4000_0000 sized by one synthesis-time parameter over a 500 KB–32 MB range (bare-metal dispatch loops at the bottom of the range; trimmed Linux tinyconfig or seL4 images at 1–4 MB; Linux plus CPython userland at 16 MB), a 1 GB LPDDR5 DRAM window at 0x8000_0000 whose behavioral controller models row-activate plus CAS latency as a programmable parameter, a PCIe Gen5 x16 endpoint at 0xC000_0000, an NVMe storage controller at 0xD000_0000, and the PNM window at 0xF000_0000. Each tier passes its own self-checking testbench (tb_bmc_router.v, tb_router_mcu.v, tb_router_sbc_moe.v, tb_router_sbc.v).</w:t>
+      </w:r>
+    </w:p>
+    <w:p>
+      <w:pPr>
+        <w:pStyle w:val="BodyText"/>
+      </w:pPr>
+      <w:r>
+        <w:t xml:space="preserve">Two of the SBC-tier blocks deserve specification because they change what the router chip can do unaided. The PCIe Gen5 x16 PHY (pcie_phy.v) terminates the host uplink of Section</w:t>
+      </w:r>
+      <w:r>
+        <w:t xml:space="preserve"> </w:t>
+      </w:r>
+      <w:hyperlink w:anchor="sec:4.2">
+        <w:r>
+          <w:rPr>
+            <w:rStyle w:val="Hyperlink"/>
+          </w:rPr>
+          <w:t xml:space="preserve">4.2</w:t>
+        </w:r>
+      </w:hyperlink>
+      <w:r>
+        <w:t xml:space="preserve"> </w:t>
+      </w:r>
+      <w:r>
+        <w:t xml:space="preserve">in silicon rather than as a paper abstraction: an LTSSM walks Detect through L0, posted/completion headers stage through a completion FIFO whose pop is deferred one cycle to keep the ready/valid contract under spine backpressure (the exact bug class Section HIGH-11 of the audit log documents fixing), and a loopback parameter drives link bring-up without a live host—verified by twelve self-checking scenarios in tb_pcie_phy.v. The NVMe storage controller (nvme_ctrl.v) attaches commodity M.2/U.2 SSDs behind a 64-deep command queue and 512-byte block engine, giving the router chip a persistence tier the fabric nodes deliberately lack: boot images and rootfs survive power cycles without re-streaming from the host, KV-cache offload spills to local flash instead of crossing the PCIe uplink, and the C firmware’s block driver (pnm_nvme.c) plus Lustre striping client (pnm_lustre.c) speak the same registers from userland or bare metal. The result is a management plane that boots standalone—POST, routing tables, weights—while every byte of compute state remains in the chassis’s commodity DRAM pools where Sections</w:t>
+      </w:r>
+      <w:r>
+        <w:t xml:space="preserve"> </w:t>
+      </w:r>
+      <w:hyperlink w:anchor="sec:2.4">
+        <w:r>
+          <w:rPr>
+            <w:rStyle w:val="Hyperlink"/>
+          </w:rPr>
+          <w:t xml:space="preserve">2.4</w:t>
+        </w:r>
+      </w:hyperlink>
+      <w:r>
+        <w:t xml:space="preserve"> </w:t>
+      </w:r>
+      <w:r>
+        <w:t xml:space="preserve">and</w:t>
+      </w:r>
+      <w:r>
+        <w:t xml:space="preserve"> </w:t>
+      </w:r>
+      <w:hyperlink w:anchor="sec:2.16">
+        <w:r>
+          <w:rPr>
+            <w:rStyle w:val="Hyperlink"/>
+          </w:rPr>
+          <w:t xml:space="preserve">2.16</w:t>
+        </w:r>
+      </w:hyperlink>
+      <w:r>
+        <w:t xml:space="preserve"> </w:t>
+      </w:r>
+      <w:r>
+        <w:t xml:space="preserve">place it.</w:t>
+      </w:r>
+    </w:p>
+    <w:p>
+      <w:pPr>
+        <w:pStyle w:val="BodyText"/>
+      </w:pPr>
+      <w:r>
         <w:t xml:space="preserve">The PNM router engine is a simplified version of the router_chip.v fabric controller, driven by CPU register writes instead of a host PCIe stream. It implements a flit builder with CRC-16/CCITT-FALSE integrity checking, matching the fabric’s wire format (Section</w:t>
       </w:r>
       <w:r>
@@ -8164,9 +8267,9 @@
         <w:t xml:space="preserve">); all three generations pass identically, which is the machine-checked form of the claim that the chassis software stack is memory-generation agnostic. Where the deskside tier needs the controller itself rather than its timing alone, sodimm_ctrl.v implements a real banked DDR controller behind the identical bus contract: a per-bank open-row tracker drives activate/precharge/CAS micro-sequences under enforced tRAS, so a row hit costs CAS latency, a miss adds tRCD, a conflict adds tRP+tRCD, and refresh closes every bank while never dropping an accepted command; tb_sodimm_ctrl.v checks those three latencies in closed form across DDR4-class and DDR5-class profiles, along with byte-enable masking and refresh-storm integrity.</w:t>
       </w:r>
     </w:p>
-    <w:bookmarkEnd w:id="33"/>
-    <w:bookmarkEnd w:id="34"/>
-    <w:bookmarkStart w:id="35" w:name="sec:2.18"/>
+    <w:bookmarkEnd w:id="44"/>
+    <w:bookmarkEnd w:id="45"/>
+    <w:bookmarkStart w:id="46" w:name="sec:2.18"/>
     <w:p>
       <w:pPr>
         <w:pStyle w:val="Heading2"/>
@@ -8303,8 +8406,8 @@
         <w:t xml:space="preserve">add per-population wire delay into the closed-form latency expression as a compile-time constant rather than a statistical spread: each populated segment contributes exactly its configured delay, and the co-simulation’s hop accounting already treats every such segment as one cycle of the closed form.</w:t>
       </w:r>
     </w:p>
-    <w:bookmarkEnd w:id="35"/>
-    <w:bookmarkStart w:id="36" w:name="sec:2.19"/>
+    <w:bookmarkEnd w:id="46"/>
+    <w:bookmarkStart w:id="47" w:name="sec:2.19"/>
     <w:p>
       <w:pPr>
         <w:pStyle w:val="Heading2"/>
@@ -8411,9 +8514,9 @@
         <w:t xml:space="preserve">on arrival (the shared crc16 engine) and refuses corrupt frames exactly as a node doorbell would, keeping silent corruption from propagating into a second chassis. A six-scenario testbench (tb_optical_link.v) pins the model down: exact idle-link latency, 200-word burst framing alignment against a scoreboard, a 600-word back-to-back flood delivered with zero loss, sparse packets separated by idle gaps and held in order, an asynchronous 100 MHz-to-80 MHz clock-domain crossing under sustained overload that observes transmit ready deassert, and simultaneous bidirectional traffic across the pair.</w:t>
       </w:r>
     </w:p>
-    <w:bookmarkEnd w:id="36"/>
-    <w:bookmarkEnd w:id="37"/>
-    <w:bookmarkStart w:id="46" w:name="sec:results"/>
+    <w:bookmarkEnd w:id="47"/>
+    <w:bookmarkEnd w:id="48"/>
+    <w:bookmarkStart w:id="57" w:name="sec:results"/>
     <w:p>
       <w:pPr>
         <w:pStyle w:val="Heading1"/>
@@ -8461,7 +8564,7 @@
         <w:t xml:space="preserve">.</w:t>
       </w:r>
     </w:p>
-    <w:bookmarkStart w:id="39" w:name="sec:3.1"/>
+    <w:bookmarkStart w:id="50" w:name="sec:3.1"/>
     <w:p>
       <w:pPr>
         <w:pStyle w:val="Heading2"/>
@@ -8757,7 +8860,7 @@
         <w:t xml:space="preserve">)</w:t>
       </w:r>
     </w:p>
-    <w:bookmarkStart w:id="38" w:name="sec:3.1.1"/>
+    <w:bookmarkStart w:id="49" w:name="sec:3.1.1"/>
     <w:p>
       <w:pPr>
         <w:pStyle w:val="Heading3"/>
@@ -8841,9 +8944,9 @@
         <w:t xml:space="preserve">bounds each hop regardless of which experts the gate selects. Nothing in the configuration is specific to this model family: the compiler re-derives placements, bitmaps, and dispatch plans from any config.json/safetensors pair, which is what makes the appliance a configuration of the architecture rather than a distinct machine.</w:t>
       </w:r>
     </w:p>
-    <w:bookmarkEnd w:id="38"/>
-    <w:bookmarkEnd w:id="39"/>
-    <w:bookmarkStart w:id="40" w:name="sec:3.2"/>
+    <w:bookmarkEnd w:id="49"/>
+    <w:bookmarkEnd w:id="50"/>
+    <w:bookmarkStart w:id="51" w:name="sec:3.2"/>
     <w:p>
       <w:pPr>
         <w:pStyle w:val="Heading2"/>
@@ -9381,8 +9484,8 @@
         <w:t xml:space="preserve">. MoE expert weight-streaming sits near 1–2 FLOP/byte per token—below the 3.0 FP16 balance and far below the 6.0 INT8 balance, so MoE is bandwidth-bound on the precision it actually runs, even at the top of its intensity range. Performance is therefore limited by the LPDDR6 bus, never by the MAC array, for both flagship workloads. This is the load-bearing argument for DUV: a 14 nm or 28 nm array already saturates the memory it is attached to.</w:t>
       </w:r>
     </w:p>
-    <w:bookmarkEnd w:id="40"/>
-    <w:bookmarkStart w:id="41" w:name="sec:3.3"/>
+    <w:bookmarkEnd w:id="51"/>
+    <w:bookmarkStart w:id="52" w:name="sec:3.3"/>
     <w:p>
       <w:pPr>
         <w:pStyle w:val="Heading2"/>
@@ -9623,8 +9726,8 @@
         <w:t xml:space="preserve">, and the 2025–26 spot prices used here reflect a shortage-driven spike; but the structural factors—commodity modules versus interposer-bound stacks, mature-node DUV versus EUV, standard packaging versus advanced integration—persist across market cycles. The advantage is architectural, not a bet on a particular price point.</w:t>
       </w:r>
     </w:p>
-    <w:bookmarkEnd w:id="41"/>
-    <w:bookmarkStart w:id="42" w:name="sec:3.4"/>
+    <w:bookmarkEnd w:id="52"/>
+    <w:bookmarkStart w:id="53" w:name="sec:3.4"/>
     <w:p>
       <w:pPr>
         <w:pStyle w:val="Heading2"/>
@@ -9950,8 +10053,8 @@
         <w:t xml:space="preserve">per-hop delay plus message bytes divided by the link rate; the co-simulation checks the hop-count and serialization terms exactly and treats contention as a separate, compile-time-scheduled term.</w:t>
       </w:r>
     </w:p>
-    <w:bookmarkEnd w:id="42"/>
-    <w:bookmarkStart w:id="43" w:name="sec:3.5"/>
+    <w:bookmarkEnd w:id="53"/>
+    <w:bookmarkStart w:id="54" w:name="sec:3.5"/>
     <w:p>
       <w:pPr>
         <w:pStyle w:val="Heading2"/>
@@ -10256,8 +10359,8 @@
         <w:t xml:space="preserve">: exact multi-stage latency, a 200-packet/1,408-byte stream delivered byte-exact in order, and triple-link activity counters matching injection counts.</w:t>
       </w:r>
     </w:p>
-    <w:bookmarkEnd w:id="43"/>
-    <w:bookmarkStart w:id="44" w:name="sec:3.6"/>
+    <w:bookmarkEnd w:id="54"/>
+    <w:bookmarkStart w:id="55" w:name="sec:3.6"/>
     <w:p>
       <w:pPr>
         <w:pStyle w:val="Heading2"/>
@@ -10814,7 +10917,21 @@
         </w:r>
       </w:hyperlink>
       <w:r>
-        <w:t xml:space="preserve">). Unlike the compute nodes, which are fixed-function MAC ASICs, the router chip is fully programmable—it runs firmware from on-chip ROM, handles PCIe host uplinks, performs POST discovery, evaluates MoE gating networks, and dispatches tokens into the fabric. The router die is smaller than the compute die (no MAC array, no LPDDR6 PHY), uses the same mature-node process, and is socketed and cold-swappable for serviceability.</w:t>
+        <w:t xml:space="preserve">). Unlike the compute nodes, which are fixed-function MAC ASICs, the router chip is fully programmable—it runs firmware from on-chip ROM, handles PCIe Gen5 x16 host uplinks through its integrated PHY (Section</w:t>
+      </w:r>
+      <w:r>
+        <w:t xml:space="preserve"> </w:t>
+      </w:r>
+      <w:hyperlink w:anchor="sec:4.2">
+        <w:r>
+          <w:rPr>
+            <w:rStyle w:val="Hyperlink"/>
+          </w:rPr>
+          <w:t xml:space="preserve">4.2</w:t>
+        </w:r>
+      </w:hyperlink>
+      <w:r>
+        <w:t xml:space="preserve">), performs POST discovery, evaluates MoE gating networks, attaches NVMe storage for its own persistence tier, and dispatches tokens into the fabric. The router die is smaller than the compute die (no MAC array, no 192-bit LPDDR6 PHY; its DRAM interface is a single LPDDR5-class controller window sized in hundreds of megabytes), uses the same mature-node process, carries an SRAM bank synthesized anywhere in a 500 KB–32 MB range by board tier, and is socketed and cold-swappable for serviceability.</w:t>
       </w:r>
     </w:p>
     <w:p>
@@ -10894,13 +11011,13 @@
         <w:t xml:space="preserve"> </w:t>
       </w:r>
       <w:r>
-        <w:t xml:space="preserve">fp32_alu | FP32 | 1–25 cycles | ALU (ADD/SUB/MUL/DIV/MIN/MAX/CMP) | Layer norm, softmax, activation functions</w:t>
-      </w:r>
-      <w:r>
-        <w:t xml:space="preserve"> </w:t>
-      </w:r>
-      <w:r>
-        <w:t xml:space="preserve">int8_mac | INT8 | 1 cycle | Multiply-Accumulate | Quantized inference, INT8 weight-stationary kernels</w:t>
+        <w:t xml:space="preserve">fp32_alu | FP32 | 3–25 cycles | ALU (ADD/SUB/MUL/DIV/MIN/MAX/CMP) | Layer norm, softmax, activation functions</w:t>
+      </w:r>
+      <w:r>
+        <w:t xml:space="preserve"> </w:t>
+      </w:r>
+      <w:r>
+        <w:t xml:space="preserve">int8_mac | INT8 | 2 cycles | Multiply-Accumulate | Quantized inference, INT8 weight-stationary kernels</w:t>
       </w:r>
     </w:p>
     <w:p>
@@ -10908,7 +11025,7 @@
         <w:pStyle w:val="BodyText"/>
       </w:pPr>
       <w:r>
-        <w:t xml:space="preserve">The ‘fp32_alu‘ unit deserves particular attention: it provides the division operation that the FMA units lack, and division is essential for normalization layers (layer norm, batch norm, softmax denominator). The ALU implements restoring binary long division with a 25-cycle latency, alongside single-cycle MIN/MAX/CMP and 4-cycle FMA-path ADD/SUB/MUL. A dedicated ‘fp32_alu_chip‘ wrapper integrates the ALU with the PNM fabric’s AXI-Stream interface: it deserializes 4-byte FP32 operands from the flit byte stream, feeds them to the ALU, and serializes the result back, all while running the CRC half of the doorbell discipline in hardware. This chip is the compute unit that sits behind the PE tile stub (Section</w:t>
+        <w:t xml:space="preserve">The ‘fp32_alu‘ unit deserves particular attention: it provides the division operation that the FMA units lack, and division is essential for normalization layers (layer norm, batch norm, softmax denominator). The ALU implements restoring binary long division with a 25-cycle latency, alongside 3-cycle MIN/MAX/CMP and 4-cycle FMA-path ADD/SUB/MUL. A dedicated ‘fp32_alu_chip‘ wrapper integrates the ALU with the PNM fabric’s AXI-Stream interface: it deserializes 4-byte FP32 operands from the flit byte stream, feeds them to the ALU, and serializes the result back, all while running the CRC half of the doorbell discipline in hardware. This chip is the compute unit that sits behind the PE tile stub (Section</w:t>
       </w:r>
       <w:r>
         <w:t xml:space="preserve"> </w:t>
@@ -10978,8 +11095,8 @@
         <w:t xml:space="preserve">possible.</w:t>
       </w:r>
     </w:p>
-    <w:bookmarkEnd w:id="44"/>
-    <w:bookmarkStart w:id="45" w:name="sec:3.7"/>
+    <w:bookmarkEnd w:id="55"/>
+    <w:bookmarkStart w:id="56" w:name="sec:3.7"/>
     <w:p>
       <w:pPr>
         <w:pStyle w:val="Heading2"/>
@@ -11220,9 +11337,9 @@
         <w:t xml:space="preserve">$1M, 10 kW board stack rather than an interposer-bound accelerator tray, so scale-out economics inherit the commodity-memory advantage rather than diluting it.</w:t>
       </w:r>
     </w:p>
-    <w:bookmarkEnd w:id="45"/>
-    <w:bookmarkEnd w:id="46"/>
-    <w:bookmarkStart w:id="52" w:name="sec:discussion"/>
+    <w:bookmarkEnd w:id="56"/>
+    <w:bookmarkEnd w:id="57"/>
+    <w:bookmarkStart w:id="64" w:name="sec:discussion"/>
     <w:p>
       <w:pPr>
         <w:pStyle w:val="Heading1"/>
@@ -11231,7 +11348,7 @@
         <w:t xml:space="preserve">Discussion</w:t>
       </w:r>
     </w:p>
-    <w:bookmarkStart w:id="47" w:name="sec:4.1"/>
+    <w:bookmarkStart w:id="58" w:name="sec:4.1"/>
     <w:p>
       <w:pPr>
         <w:pStyle w:val="Heading2"/>
@@ -11276,8 +11393,8 @@
         <w:t xml:space="preserve">); (4) re-export the amended schema at the next batch boundary. Routing tables are immutable within a boot session, so step (4) is a controller-coordinated reload, not runtime adaptation: the router regenerates the AOT tables against the amended schema and loads them during the batch boundary, when the fabric is quiet. The chassis continues in degraded mode with no restart. A failed spine lane is handled at the physical layer—periodic link re-training excludes the dead lane and the remaining lanes re-lane transparently—so routing tables need no change for lane degradation; total spine failure partitions the chassis (the Conclusion section).</w:t>
       </w:r>
     </w:p>
-    <w:bookmarkEnd w:id="47"/>
-    <w:bookmarkStart w:id="48" w:name="sec:4.2"/>
+    <w:bookmarkEnd w:id="58"/>
+    <w:bookmarkStart w:id="59" w:name="sec:4.2"/>
     <w:p>
       <w:pPr>
         <w:pStyle w:val="Heading2"/>
@@ -11319,8 +11436,8 @@
         <w:t xml:space="preserve">—well below uplink and spine capacity. The host never touches the compute fabric directly.</w:t>
       </w:r>
     </w:p>
-    <w:bookmarkEnd w:id="48"/>
-    <w:bookmarkStart w:id="49" w:name="sec:4.3"/>
+    <w:bookmarkEnd w:id="59"/>
+    <w:bookmarkStart w:id="60" w:name="sec:4.3"/>
     <w:p>
       <w:pPr>
         <w:pStyle w:val="Heading2"/>
@@ -11446,8 +11563,8 @@
         <w:t xml:space="preserve">).</w:t>
       </w:r>
     </w:p>
-    <w:bookmarkEnd w:id="49"/>
-    <w:bookmarkStart w:id="50" w:name="sec:4.4"/>
+    <w:bookmarkEnd w:id="60"/>
+    <w:bookmarkStart w:id="61" w:name="sec:4.4"/>
     <w:p>
       <w:pPr>
         <w:pStyle w:val="Heading2"/>
@@ -11588,8 +11705,8 @@
         <w:t xml:space="preserve">); a router failure halts dispatch until the spare is in place.</w:t>
       </w:r>
     </w:p>
-    <w:bookmarkEnd w:id="50"/>
-    <w:bookmarkStart w:id="51" w:name="sec:4.5"/>
+    <w:bookmarkEnd w:id="61"/>
+    <w:bookmarkStart w:id="62" w:name="sec:4.5"/>
     <w:p>
       <w:pPr>
         <w:pStyle w:val="Heading2"/>
@@ -11893,23 +12010,108 @@
         <w:t xml:space="preserve">—then frees fabrication capacity back toward commodity DRAM as the mix shifts. Training retains HBM’s bandwidth economics; inference—the majority—moves to capacity economics, where commodity modules with no interposer dependency and mature-node yields above 90% dominate on both physical and economic grounds. The memory market bifurcates, and this machine is built for the inference half.</w:t>
       </w:r>
     </w:p>
+    <w:bookmarkEnd w:id="62"/>
+    <w:bookmarkStart w:id="63" w:name="sec:4.6"/>
+    <w:p>
+      <w:pPr>
+        <w:pStyle w:val="Heading2"/>
+      </w:pPr>
+      <w:r>
+        <w:t xml:space="preserve">4.6 Security posture, design-for-test, and manufacturing readiness</w:t>
+      </w:r>
+    </w:p>
+    <w:p>
+      <w:pPr>
+        <w:pStyle w:val="FirstParagraph"/>
+      </w:pPr>
+      <w:r>
+        <w:t xml:space="preserve">The security model follows from the same property that makes the fabric verifiable: state lives in exactly one place. Compute nodes hold no secrets and no mutable control state—their only configuration is the POST-loaded routing bitmap and kernel constants—so there is nothing on a node to escalate against, and the lxy_repeater’s hardwired bitmask barrier (Section</w:t>
+      </w:r>
+      <w:r>
+        <w:t xml:space="preserve"> </w:t>
+      </w:r>
+      <w:hyperlink w:anchor="sec:2.1">
+        <w:r>
+          <w:rPr>
+            <w:rStyle w:val="Hyperlink"/>
+          </w:rPr>
+          <w:t xml:space="preserve">2.1</w:t>
+        </w:r>
+      </w:hyperlink>
+      <w:r>
+        <w:t xml:space="preserve">) doubles as a hardware isolation boundary no firmware can reconfigure because no such register exists</w:t>
+      </w:r>
+      <w:r>
+        <w:t xml:space="preserve">. The attack surface concentrates on the router chip, which the RTL addresses at four layers. First, secure boot: the 64 KB boot ROM is mask-programmed (combinational, unwritable by construction), and the firmware image it chains to is hash-verified before the CLINT timer or PNM window is released to user code. Second, privilege separation: the RV32 core implements machine-mode CSRs plus physical memory protection (PMP), and the seL4 deployment option (Section</w:t>
+      </w:r>
+      <w:r>
+        <w:t xml:space="preserve"> </w:t>
+      </w:r>
+      <w:hyperlink w:anchor="sec:2.17">
+        <w:r>
+          <w:rPr>
+            <w:rStyle w:val="Hyperlink"/>
+          </w:rPr>
+          <w:t xml:space="preserve">2.17</w:t>
+        </w:r>
+      </w:hyperlink>
+      <w:r>
+        <w:t xml:space="preserve">) replaces the monolithic kernel with a formally verified microkernel whose capability system mediates every device-frame mapping—the root task cannot touch UART or PNM registers without an explicit capability grant. Third, debug lockdown: the JTAG TAP present for bring-up fuses into a locked state at production, with re-entry requiring a signed challenge over the host PCIe link. Fourth, sideband integrity: NODE_ERR and TOPOLOGY_RDY travel on physically separate wires (Section</w:t>
+      </w:r>
+      <w:r>
+        <w:t xml:space="preserve"> </w:t>
+      </w:r>
+      <w:hyperlink w:anchor="sec:2.4">
+        <w:r>
+          <w:rPr>
+            <w:rStyle w:val="Hyperlink"/>
+          </w:rPr>
+          <w:t xml:space="preserve">2.4</w:t>
+        </w:r>
+      </w:hyperlink>
+      <w:r>
+        <w:t xml:space="preserve">) that no data-path fault can mask, so fault injection on the NoB cannot silence the error channel that Section</w:t>
+      </w:r>
+      <w:r>
+        <w:t xml:space="preserve"> </w:t>
+      </w:r>
+      <w:hyperlink w:anchor="sec:4.1">
+        <w:r>
+          <w:rPr>
+            <w:rStyle w:val="Hyperlink"/>
+          </w:rPr>
+          <w:t xml:space="preserve">4.1</w:t>
+        </w:r>
+      </w:hyperlink>
+      <w:r>
+        <w:t xml:space="preserve">’s recovery protocol depends on.</w:t>
+      </w:r>
+    </w:p>
     <w:p>
       <w:pPr>
         <w:pStyle w:val="BodyText"/>
       </w:pPr>
       <w:r>
-        <w:t xml:space="preserve">The structural consequence is that HBM demand is coupled to exactly the workload class where this architecture substitutes commodity DRAM. Every inference token served on LPDDR6 displaces an HBM-resident weight read; because inference is the majority and fastest-growing share of AI compute</w:t>
-      </w:r>
-      <w:r>
-        <w:t xml:space="preserve">, serving that share on capacity-optimized memory slows the industry’s HBM demand growth. HBM’s disproportionate wafer footprint—the proximate cause of the 2025–26 DRAM shortage and its price spike</w:t>
-      </w:r>
-      <w:r>
-        <w:t xml:space="preserve">—then frees fabrication capacity back toward commodity DRAM as the mix shifts. Training retains HBM’s bandwidth economics; inference—the majority—moves to capacity economics, where commodity modules with no interposer dependency and mature-node yields above 90% dominate on both physical and economic grounds. The memory market bifurcates, and this machine is built for the inference half.</w:t>
-      </w:r>
-    </w:p>
-    <w:bookmarkEnd w:id="51"/>
-    <w:bookmarkEnd w:id="52"/>
-    <w:bookmarkStart w:id="53" w:name="sec:conclusion"/>
+        <w:t xml:space="preserve">Design-for-test follows the same concentration principle. Both dies carry a JTAG TAP; the router SoC adds a scan-mode override on its clock-gating cells (the latch-based gate passes the test clock unconditionally when scan_en asserts, so gated domains remain observable during scan shift), and every asynchronous reset crossing passes through a two-flop synchronizer (rst_sync.v) so reset-domain crossings are scan-compatible rather than metastability hazards. On-chip memories—router SRAM, node elastic buffers—are reached by a bounded MBIST sequence run from ROM before POST Phase 1, so a bad SRAM word never reaches the topology inventory. The PHY blocks self-test through loopback: the PCIe endpoint’s LOOPBACK parameter drives LTSSM through lane bring-up with no external partner, and the optical links’ CRC-on-arrival check (Section</w:t>
+      </w:r>
+      <w:r>
+        <w:t xml:space="preserve"> </w:t>
+      </w:r>
+      <w:hyperlink w:anchor="sec:2.19">
+        <w:r>
+          <w:rPr>
+            <w:rStyle w:val="Hyperlink"/>
+          </w:rPr>
+          <w:t xml:space="preserve">2.19</w:t>
+        </w:r>
+      </w:hyperlink>
+      <w:r>
+        <w:t xml:space="preserve">) doubles as an in-field signal-integrity monitor. Manufacturing hand-off artifacts ship alongside the RTL rather than after it: SDC timing constraints for the 100 MHz reference domain with false paths enumerated for the combinational ROM/SRAM reads and async resets (pnm_soc.sdc), a device tree source describing the full router-chip memory map for NOMMU Linux boot (pnm_soc.dts), and the assembly schema of the companion repository that composes verified modules into board-level netlists. What remains vendor-dependent—SerDes analog characterization, package bond maps, floorplan extraction—is explicitly outside the RTL’s claims, consistent with this paper’s practice of labeling engineering estimates rather than claiming them away.</w:t>
+      </w:r>
+    </w:p>
+    <w:bookmarkEnd w:id="63"/>
+    <w:bookmarkEnd w:id="64"/>
+    <w:bookmarkStart w:id="65" w:name="sec:conclusion"/>
     <w:p>
       <w:pPr>
         <w:pStyle w:val="Heading1"/>
@@ -11977,8 +12179,8 @@
         <w:t xml:space="preserve">, the build and simulation code under AGPL-3.0-or-later, and this manuscript under CC BY-SA 4.0.</w:t>
       </w:r>
     </w:p>
-    <w:bookmarkEnd w:id="53"/>
-    <w:bookmarkStart w:id="54" w:name="sec:acknowledgments"/>
+    <w:bookmarkEnd w:id="65"/>
+    <w:bookmarkStart w:id="66" w:name="sec:acknowledgments"/>
     <w:p>
       <w:pPr>
         <w:pStyle w:val="Heading1"/>
@@ -12371,12 +12573,8 @@
         <w:t xml:space="preserve">JEDEC Solid State Technology Association. Double data rate 5 (DDR5) SDRAM standard. JESD79-5C, 2024.</w:t>
       </w:r>
     </w:p>
-    <w:bookmarkEnd w:id="54"/>
-    <w:sectPr>
-      <w:footnotePr>
-        <w:numRestart w:val="eachSect"/>
-      </w:footnotePr>
-    </w:sectPr>
+    <w:bookmarkEnd w:id="66"/>
+    <w:sectPr/>
   </w:body>
 </w:document>
 </file>
@@ -12548,6 +12746,8 @@
     </w:pPr>
     <w:rPr>
       <w:rFonts w:asciiTheme="majorHAnsi" w:cstheme="majorBidi" w:eastAsiaTheme="majorEastAsia" w:hAnsiTheme="majorHAnsi"/>
+      <w:spacing w:val="-10"/>
+      <w:kern w:val="28"/>
       <w:sz w:val="56"/>
       <w:szCs w:val="56"/>
     </w:rPr>
@@ -12560,6 +12760,8 @@
     <w:rsid w:val="00A10FD9"/>
     <w:rPr>
       <w:rFonts w:asciiTheme="majorHAnsi" w:cstheme="majorBidi" w:eastAsiaTheme="majorEastAsia" w:hAnsiTheme="majorHAnsi"/>
+      <w:spacing w:val="-10"/>
+      <w:kern w:val="28"/>
       <w:sz w:val="56"/>
       <w:szCs w:val="56"/>
     </w:rPr>
@@ -12600,31 +12802,23 @@
   </w:style>
   <w:style w:customStyle="1" w:styleId="Author" w:type="paragraph">
     <w:name w:val="Author"/>
-    <w:basedOn w:val="Title"/>
     <w:next w:val="BodyText"/>
     <w:qFormat/>
     <w:pPr>
       <w:keepNext/>
       <w:keepLines/>
+      <w:jc w:val="center"/>
     </w:pPr>
-    <w:rPr>
-      <w:sz w:val="24"/>
-      <w:szCs w:val="24"/>
-    </w:rPr>
   </w:style>
   <w:style w:styleId="Date" w:type="paragraph">
     <w:name w:val="Date"/>
-    <w:basedOn w:val="Title"/>
     <w:next w:val="BodyText"/>
     <w:qFormat/>
     <w:pPr>
       <w:keepNext/>
       <w:keepLines/>
+      <w:jc w:val="center"/>
     </w:pPr>
-    <w:rPr>
-      <w:sz w:val="24"/>
-      <w:szCs w:val="24"/>
-    </w:rPr>
   </w:style>
   <w:style w:customStyle="1" w:styleId="AbstractTitle" w:type="paragraph">
     <w:name w:val="Abstract Title"/>

</xml_diff>

<commit_message>
Fix C firmware parity and documentation errors
</commit_message>
<xml_diff>
--- a/paper/submission/paper.docx
+++ b/paper/submission/paper.docx
@@ -40,7 +40,10 @@
         <w:pStyle w:val="FirstParagraph"/>
       </w:pPr>
       <w:r>
-        <w:t xml:space="preserve">The memory wall has hardened into a physical wall: High-Bandwidth Memory capacity per package is bounded by interposer reticle limits, and the advanced lithography behind HBM stacks suffers low yields and extreme power density that no market correction can resolve</w:t>
+        <w:t xml:space="preserve">The memory wall has hardened into a physical wall: High-Bandwidth Memory capacity per package is bounded by interposer reticle limits</w:t>
+      </w:r>
+      <w:r>
+        <w:t xml:space="preserve">, and the advanced lithography behind HBM stacks suffers low yields and extreme power density that no market correction can resolve</w:t>
       </w:r>
       <w:r>
         <w:t xml:space="preserve">, just as the workload mix shifts toward capacity-bound jobs—including Mixture-of-Experts transformer inference, scientific stencil computation, climate modeling, seismic imaging, and large-scale numerical simulation—whose binding resource is resident memory, not peak FLOPs</w:t>
@@ -55,7 +58,7 @@
         <w:t xml:space="preserve">paired with mature-node DUV MAC ASICs, wired by a deterministic single-spine wormhole fabric of stateless Hardware Flit Repeaters and combinational lxy_repeater nodes that replaces runtime scheduling and cache coherency with coordinate arithmetic and closed-form latency bounds</w:t>
       </w:r>
       <w:r>
-        <w:t xml:space="preserve">. A 512-node reference chassis provides 64 TB of attached memory, 131 TB/s aggregate node-local bandwidth, and approximately 197 TFLOPS FP64 at approximately 15 W per node—8–10 kW per chassis against 0.6 MW for capacity-equivalent HBM—managed by one socketed RISC-V BMC/router chip handling topology discovery, workload dispatch, and host PCIe</w:t>
+        <w:t xml:space="preserve">. A 512-node reference chassis provides 64 TB of attached memory, 131 TB/s aggregate node-local bandwidth, and approximately 197 TFLOPS FP64 at approximately 15 W per node—8–10 kW per chassis against 0.25 MW for capacity-equivalent HBM—managed by one socketed RISC-V BMC/router chip handling topology discovery, workload dispatch, and host PCIe</w:t>
       </w:r>
       <w:r>
         <w:t xml:space="preserve">. The result is bit-exact-reproducible computation with provable deadlock freedom, compile-time latency bounds, and a fraction of the thermal envelope, interposer dependency, and manufacturing complexity of monolithic GPU accelerators.</w:t>
@@ -131,7 +134,7 @@
         <w:t xml:space="preserve">. The architecture described in this paper sidesteps all three limits by replacing interposer-bound HBM with commodity LPDDR6 CAMM2 modules</w:t>
       </w:r>
       <w:r>
-        <w:t xml:space="preserve">—each a standard JEDEC part with no interposer dependency, no advanced lithography requirement, and a thermal envelope of approximately 5 W—paired with a mature-node 14 nm or 28 nm DUV MAC ASIC. The Results section quantifies the alternative: a 512-node chassis provides 64 TB at approximately 15 W per node and approximately 8–10 kW per chassis, versus 0.6 MW and 819 GPUs for capacity-equivalent HBM.</w:t>
+        <w:t xml:space="preserve">—each a standard JEDEC part with no interposer dependency, no advanced lithography requirement, and a thermal envelope of approximately 5 W—paired with a mature-node 14 nm or 28 nm DUV MAC ASIC. The Results section quantifies the alternative: a 512-node chassis provides 64 TB at approximately 15 W per node and approximately 8–10 kW per chassis, versus 0.25 MW and 819 GPUs for capacity-equivalent HBM.</w:t>
       </w:r>
     </w:p>
     <w:bookmarkEnd w:id="21"/>
@@ -1758,7 +1761,7 @@
         <w:pStyle w:val="BodyText"/>
       </w:pPr>
       <w:r>
-        <w:t xml:space="preserve">CMD (0x01) | LAYER | MODULE_ID | LEN_HI | LEN_LO | payload... | CRC_HI | CRC_LO</w:t>
+        <w:t xml:space="preserve">CMD (0x01) | LAYER | MODULE_ID | LEN_LO | LEN_HI | payload... | CRC_HI | CRC_LO</w:t>
       </w:r>
     </w:p>
     <w:p>
@@ -1883,18 +1886,35 @@
         </m:r>
       </m:oMath>
       <w:r>
-        <w:t xml:space="preserve">) are not distributed to compute nodes: the gating network lives exclusively on the router chip, which evaluates it at runtime to determine which expert handles each token. The gating weights are small (</w:t>
-      </w:r>
-      <m:oMath>
-        <m:r>
-          <m:rPr>
-            <m:sty m:val="p"/>
-          </m:rPr>
-          <m:t>≈</m:t>
-        </m:r>
-      </m:oMath>
-      <w:r>
-        <w:t xml:space="preserve">1 MB for a 128-expert model) and fit comfortably in the router’s on-chip SRAM. In the co-simulation, this phase records the weights as loaded; in production, the weights arrive over PCIe from the host before execution begins.</w:t>
+        <w:t xml:space="preserve">) are not distributed to compute nodes: the gating network lives exclusively on the router chip, which evaluates it at runtime to determine which expert handles each token. The gating projector is compact (</w:t>
+      </w:r>
+      <m:oMath>
+        <m:r>
+          <m:t>128</m:t>
+        </m:r>
+      </m:oMath>
+      <w:r>
+        <w:t xml:space="preserve"> </w:t>
+      </w:r>
+      <w:r>
+        <w:t xml:space="preserve">experts</w:t>
+      </w:r>
+      <w:r>
+        <w:t xml:space="preserve"> </w:t>
+      </w:r>
+      <m:oMath>
+        <m:r>
+          <m:rPr>
+            <m:sty m:val="p"/>
+          </m:rPr>
+          <m:t>×</m:t>
+        </m:r>
+      </m:oMath>
+      <w:r>
+        <w:t xml:space="preserve"> </w:t>
+      </w:r>
+      <w:r>
+        <w:t xml:space="preserve">a small projection head, a few tens of KB at BF16) and fits entirely in the router’s dedicated 64 KB gating SRAM (32K BF16 entries). In the co-simulation, this phase records the weights as loaded; in production, the weights arrive over PCIe from the host before execution begins.</w:t>
       </w:r>
     </w:p>
     <w:p>
@@ -2070,7 +2090,7 @@
         <w:pStyle w:val="BodyText"/>
       </w:pPr>
       <w:r>
-        <w:t xml:space="preserve">Layer 2: The intermediate representation. The IR is a typed, register-based instruction set with two precision domains. The FP64 domain (R and Haskell) provides: f64.load, f64.store, f64.add, f64.mul, f64.fma, f64.div, f64.min, f64.max, f64.cmp, f64.mov, and f64.const. The FP32 ALU domain (HLSL) provides: alu.load, alu.store, alu.add, alu.sub, alu.mul, alu.div, alu.min, alu.max, alu.cmp, alu.dot, alu.lerp, alu.clamp, alu.rcp, and alu.mov. The IR is deliberately minimal: no loops, no branches, no dynamic memory allocation. This constraint is what makes the downstream AOT pipeline sound: every instruction maps to a fixed-function hardware unit, and the compiler can reason about the entire execution trace at compile time. Complex control flow—loops, conditionals, recursion—is lowered by the source-language front end into straight-line IR with explicit data dependencies, which the hardware executes as a static dataflow graph.</w:t>
+        <w:t xml:space="preserve">Layer 2: The intermediate representation. The IR is a typed, register-based instruction set with two precision domains. The FP64 domain (R and Haskell) provides: f64.load, f64.store, f64.add, f64.sub, f64.mul, f64.fma, f64.neg, f64.div, f64.min, f64.max, f64.cmp, f64.mov, and f64.const. The FP32 ALU domain (HLSL) provides: alu.load, alu.store, alu.const, alu.add, alu.sub, alu.mul, alu.div, alu.min, alu.max, alu.cmp, alu.dot, alu.lerp, alu.clamp, alu.rcp, and alu.mov. The IR is deliberately minimal: no loops, no branches, no dynamic memory allocation. This constraint is what makes the downstream AOT pipeline sound: every instruction maps to a fixed-function hardware unit, and the compiler can reason about the entire execution trace at compile time. Complex control flow—loops, conditionals, recursion—is lowered by the source-language front end into straight-line IR with explicit data dependencies, which the hardware executes as a static dataflow graph.</w:t>
       </w:r>
     </w:p>
     <w:p>
@@ -2128,7 +2148,7 @@
         </w:r>
       </w:hyperlink>
       <w:r>
-        <w:t xml:space="preserve">) with least-recently-used eviction when capacity is exhausted. A C port targets MCU implementations (ARM Cortex-M/R, RISC-V) for embedded deployments, using static allocation only—no ‘malloc‘, no dynamic memory, no operating-system dependency. The C port mirrors the Go firmware’s data structures: a ‘firmware_t‘ struct holds the complete state (routing table, MoE map, weight commands, KV cache, dispatch records) as statically sized arrays, with configuration constants such as ‘PNM_MAX_LAYERS=8‘, ‘PNM_MAX_NODES_TOTAL=512‘, ‘PNM_MAX_EXPERTS=256‘, and ‘PNM_KV_CACHE_DEPTH=4096‘; it implements the identical five-phase boot and dispatch loop and compiles cleanly with ‘gcc -Wall -Wextra -std=c11‘ against the Go firmware’s golden model.</w:t>
+        <w:t xml:space="preserve">) with least-recently-used eviction when capacity is exhausted. A C port targets MCU implementations (ARM Cortex-M/R, RISC-V) for embedded deployments, using static allocation only—no ‘malloc‘, no dynamic memory, no operating-system dependency. The C port mirrors the Go firmware’s data structures: a ‘firmware_t‘ struct holds the complete state (routing table, MoE map, weight commands, KV cache, dispatch records) as statically sized arrays, with configuration constants that scale by compile target—under ‘PNM_MCU‘ reduced limits for small microcontrollers (up to ‘PNM_MAX_LAYERS=2‘, ‘PNM_MAX_NODES_TOTAL=32‘, ‘PNM_MAX_EXPERTS=16‘, and ‘PNM_KV_CACHE_DEPTH=64‘), and the full SoC defaults otherwise (‘PNM_MAX_LAYERS=8‘, ‘PNM_MAX_NODES_TOTAL=512‘, ‘PNM_MAX_EXPERTS=256‘, and ‘PNM_KV_CACHE_DEPTH=4096‘); it implements the identical five-phase boot and dispatch loop and compiles cleanly with ‘gcc -Wall -Wextra -std=c11‘ against the Go firmware’s golden model.</w:t>
       </w:r>
     </w:p>
     <w:p>
@@ -6781,7 +6801,7 @@
         </m:r>
       </m:oMath>
       <w:r>
-        <w:t xml:space="preserve">Y (intra-layer). Nearest-neighbor stencils, halo exchanges, and any communication confined to a single board. The route never enters the spine, so its latency is a compile-time constant independent of chassis depth: two X-hops plus PE pipe delay. This is the cheapest pattern and should be preferred whenever data locality permits.</w:t>
+        <w:t xml:space="preserve">Y (intra-layer). Nearest-neighbor stencils, halo exchanges, and any communication confined to a single board. The route never enters the spine, so its latency is a compile-time constant independent of chassis depth: a single dimension-order hop for a nearest-neighbor halo exchange, plus PE pipe delay. This is the cheapest pattern and should be preferred whenever data locality permits.</w:t>
       </w:r>
     </w:p>
     <w:p>
@@ -7424,7 +7444,7 @@
         </w:r>
       </w:hyperlink>
       <w:r>
-        <w:t xml:space="preserve">. Three hand-written HDL testbenches complement the harness: a functional fabric smoke test, a 500-packet load test with backpressure and per-packet checksums, and a doorbell test that drives eight packets through the PE tile stub and checks the hardened fire conditions—six activations, two refusals (a truncated message and a wrong destination), and two stub corrupt_out pulses on messages whose CRC fails in flight. Additional testbenches verify every compute unit type in isolation: FP16, BF16, FP32, and FP64 FMA modules (3-cycle pipeline, bit-exact golden-model checks), the FP32 ALU (restoring binary long division, MIN/MAX/CMP, and FMA-path operations), the INT8 MAC (single-cycle multiply-accumulate), the BF16 and FP16 systolic MAC arrays (weight loading, burst activation, zero-weight identity), the MoE gating unit (softmax top-k selection), and the router chip (POST discovery, routing-table load, weight upload, MoE map load, and inference dispatch). Beyond the fabric and compute silicon, tb_sodimm_ctrl.v verifies the banked memory controller described in Section</w:t>
+        <w:t xml:space="preserve">. Three hand-written HDL testbenches complement the harness: a functional fabric smoke test, a 500-packet load test with backpressure and per-packet checksums, and a doorbell test that drives eight packets through the PE tile stub and checks the hardened fire conditions—six activations, two refusals (a truncated message and a wrong destination), and two stub corrupt_out pulses on messages whose CRC fails in flight. Additional testbenches verify every compute unit type in isolation: FP16, BF16, FP32, and FP64 FMA modules (3-cycle pipeline, bit-exact golden-model checks), the FP32 ALU (restoring binary long division, MIN/MAX/CMP, and FMA-path operations), the INT8 MAC (two-cycle multiply-accumulate), the BF16 and FP16 systolic MAC arrays (weight loading, burst activation, zero-weight identity), the MoE gating unit (softmax top-k selection), and the router chip (POST discovery, routing-table load, weight upload, MoE map load, and inference dispatch). Beyond the fabric and compute silicon, tb_sodimm_ctrl.v verifies the banked memory controller described in Section</w:t>
       </w:r>
       <w:r>
         <w:t xml:space="preserve"> </w:t>
@@ -8094,7 +8114,7 @@
         <w:pStyle w:val="BodyText"/>
       </w:pPr>
       <w:r>
-        <w:t xml:space="preserve">The RTL ships four SoC tiers sharing the CPU and bus fabric, so a deployment scales the management plane without changing firmware structure above the register layer. The BMC tier (bmc_router_top.v) is the five-region minimal map above. The MCU tier (router_mcu.v) drops the CLINT for pure bare-metal dispatch loops. The MoE SBC tier (router_sbc_moe.v) adds a 64 KB BF16 gating SRAM, an on-chip systolic array, and the moe_gating unit so expert selection runs in silicon next to the dispatcher. The general SBC tier (router_sbc.v) is the full machine: SRAM at 0x4000_0000 sized by one synthesis-time parameter over a 500 KB–32 MB range (bare-metal dispatch loops at the bottom of the range; trimmed Linux tinyconfig or seL4 images at 1–4 MB; Linux plus CPython userland at 16 MB), a 1 GB LPDDR5 DRAM window at 0x8000_0000 whose behavioral controller models row-activate plus CAS latency as a programmable parameter, a PCIe Gen5 x16 endpoint at 0xC000_0000, an NVMe storage controller at 0xD000_0000, and the PNM window at 0xF000_0000. Each tier passes its own self-checking testbench (tb_bmc_router.v, tb_router_mcu.v, tb_router_sbc_moe.v, tb_router_sbc.v).</w:t>
+        <w:t xml:space="preserve">The RTL ships four SoC tiers sharing the CPU and bus fabric, so a deployment scales the management plane without changing firmware structure above the register layer. The BMC tier (bmc_orchestrator_top.v) is the five-region minimal map above. The MCU tier (orchestrator_mcu.v) drops the CLINT for pure bare-metal dispatch loops. The MoE SBC tier (orchestrator_sbc_moe.v) adds a 64 KB BF16 gating SRAM and the moe_gating unit so expert selection runs in silicon next to the dispatcher. The general SBC tier (orchestrator_sbc.v) is the full machine: SRAM at 0x4000_0000 sized by one synthesis-time parameter over a 500 KB–32 MB range (bare-metal dispatch loops at the bottom of the range; trimmed Linux tinyconfig or seL4 images at 1–4 MB; Linux plus CPython userland at 16 MB), a 1 GB LPDDR5 DRAM window at 0x8000_0000 whose behavioral controller models row-activate plus CAS latency as a programmable parameter, a PCIe Gen5 x16 endpoint at 0xC000_0000, an NVMe storage controller at 0xD000_0000, and the PNM window at 0xF000_0000. Each tier passes its own self-checking testbench (tb_bmc_orchestrator.v, tb_orchestrator_mcu.v, tb_orchestrator_sbc_moe.v, tb_orchestrator_sbc.v).</w:t>
       </w:r>
     </w:p>
     <w:p>
@@ -8119,7 +8139,7 @@
         <w:t xml:space="preserve"> </w:t>
       </w:r>
       <w:r>
-        <w:t xml:space="preserve">in silicon rather than as a paper abstraction: an LTSSM walks Detect through L0, posted/completion headers stage through a completion FIFO whose pop is deferred one cycle to keep the ready/valid contract under spine backpressure (the exact bug class Section HIGH-11 of the audit log documents fixing), and a loopback parameter drives link bring-up without a live host—verified by twelve self-checking scenarios in tb_pcie_phy.v. The NVMe storage controller (nvme_ctrl.v) attaches commodity M.2/U.2 SSDs behind a 64-deep command queue and 512-byte block engine, giving the router chip a persistence tier the fabric nodes deliberately lack: boot images and rootfs survive power cycles without re-streaming from the host, KV-cache offload spills to local flash instead of crossing the PCIe uplink, and the C firmware’s block driver (pnm_nvme.c) plus Lustre striping client (pnm_lustre.c) speak the same registers from userland or bare metal. The result is a management plane that boots standalone—POST, routing tables, weights—while every byte of compute state remains in the chassis’s commodity DRAM pools where Sections</w:t>
+        <w:t xml:space="preserve">in silicon rather than as a paper abstraction: an LTSSM walks Detect through L0, posted/completion headers stage through a completion FIFO whose pop is deferred one cycle to keep the ready/valid contract under spine backpressure (a ready/valid bug class the harness’s audit log documents fixing), and a loopback parameter drives link bring-up without a live host—verified by twelve self-checking scenarios in tb_pcie_phy.v. The NVMe storage controller (nvme_ctrl.v) attaches commodity M.2/U.2 SSDs behind a 64-deep command queue and 512-byte block engine, giving the router chip a persistence tier the fabric nodes deliberately lack: boot images and rootfs survive power cycles without re-streaming from the host, KV-cache offload spills to local flash instead of crossing the PCIe uplink, and the C firmware’s block driver (pnm_nvme.c) plus Lustre striping client (pnm_lustre.c) speak the same registers from userland or bare metal. The result is a management plane that boots standalone—POST, routing tables, weights—while every byte of compute state remains in the chassis’s commodity DRAM pools where Sections</w:t>
       </w:r>
       <w:r>
         <w:t xml:space="preserve"> </w:t>
@@ -8161,7 +8181,7 @@
         <w:pStyle w:val="BodyText"/>
       </w:pPr>
       <w:r>
-        <w:t xml:space="preserve">The PNM router engine is a simplified version of the router_chip.v fabric controller, driven by CPU register writes instead of a host PCIe stream. It implements a flit builder with CRC-16/CCITT-FALSE integrity checking, matching the fabric’s wire format (Section</w:t>
+        <w:t xml:space="preserve">The PNM router engine is a simplified version of the orchestrator_chip.v fabric controller, driven by CPU register writes instead of a host PCIe stream. It implements a flit builder with CRC-16/CCITT-FALSE integrity checking, matching the fabric’s wire format (Section</w:t>
       </w:r>
       <w:r>
         <w:t xml:space="preserve"> </w:t>
@@ -8200,7 +8220,7 @@
         <w:pStyle w:val="BodyText"/>
       </w:pPr>
       <w:r>
-        <w:t xml:space="preserve">The design is verified by a self-checking testbench (tb_bmc_router.v) that loads a test program into ROM, exercises UART output, PNM register writes, and the boot-done signal, and checks for correct execution of LUI, ADDI, SW, and JAL instructions. The testbench instantiates the full SoC with a 2-layer,</w:t>
+        <w:t xml:space="preserve">The design is verified by a self-checking testbench (tb_bmc_orchestrator.v) that loads a test program into ROM, exercises UART output, PNM register writes, and the boot-done signal, and checks for correct execution of LUI, ADDI, SW, and JAL instructions. The testbench instantiates the full SoC with a 2-layer,</w:t>
       </w:r>
       <w:r>
         <w:t xml:space="preserve"> </w:t>
@@ -9630,7 +9650,7 @@
         </m:r>
       </m:oMath>
       <w:r>
-        <w:t xml:space="preserve">0.6 MW of GPU power alone—against</w:t>
+        <w:t xml:space="preserve">0.25 MW of GPU power alone—against</w:t>
       </w:r>
       <w:r>
         <w:t xml:space="preserve"> </w:t>
@@ -10215,16 +10235,10 @@
       </w:r>
       <m:oMath>
         <m:r>
-          <m:t>i</m:t>
-        </m:r>
-        <m:r>
-          <m:t>m</m:t>
-        </m:r>
-        <m:r>
-          <m:t>e</m:t>
-        </m:r>
-        <m:r>
-          <m:t>s</m:t>
+          <m:rPr>
+            <m:sty m:val="p"/>
+          </m:rPr>
+          <m:t>×</m:t>
         </m:r>
       </m:oMath>
       <w:r>
@@ -10232,20 +10246,14 @@
       </w:r>
       <m:oMath>
         <m:r>
-          <m:t>i</m:t>
-        </m:r>
-        <m:r>
-          <m:t>m</m:t>
-        </m:r>
-        <m:r>
-          <m:t>e</m:t>
-        </m:r>
-        <m:r>
-          <m:t>s</m:t>
-        </m:r>
-      </m:oMath>
-      <w:r>
-        <w:t xml:space="preserve">8, eight parallel slices) exercises the full spine at scale under all six scenarios of Section</w:t>
+          <m:rPr>
+            <m:sty m:val="p"/>
+          </m:rPr>
+          <m:t>×</m:t>
+        </m:r>
+      </m:oMath>
+      <w:r>
+        <w:t xml:space="preserve">8, eight parallel slices) exercises the full spine at scale under five of the six scenarios of Section</w:t>
       </w:r>
       <w:r>
         <w:t xml:space="preserve"> </w:t>
@@ -11011,7 +11019,7 @@
         <w:t xml:space="preserve"> </w:t>
       </w:r>
       <w:r>
-        <w:t xml:space="preserve">fp32_alu | FP32 | 3–25 cycles | ALU (ADD/SUB/MUL/DIV/MIN/MAX/CMP) | Layer norm, softmax, activation functions</w:t>
+        <w:t xml:space="preserve">fp32_alu | FP32 | 3–28 cycles | ALU (ADD/SUB/MUL/DIV/MIN/MAX/CMP) | Layer norm, softmax, activation functions</w:t>
       </w:r>
       <w:r>
         <w:t xml:space="preserve"> </w:t>
@@ -11025,7 +11033,7 @@
         <w:pStyle w:val="BodyText"/>
       </w:pPr>
       <w:r>
-        <w:t xml:space="preserve">The ‘fp32_alu‘ unit deserves particular attention: it provides the division operation that the FMA units lack, and division is essential for normalization layers (layer norm, batch norm, softmax denominator). The ALU implements restoring binary long division with a 25-cycle latency, alongside 3-cycle MIN/MAX/CMP and 4-cycle FMA-path ADD/SUB/MUL. A dedicated ‘fp32_alu_chip‘ wrapper integrates the ALU with the PNM fabric’s AXI-Stream interface: it deserializes 4-byte FP32 operands from the flit byte stream, feeds them to the ALU, and serializes the result back, all while running the CRC half of the doorbell discipline in hardware. This chip is the compute unit that sits behind the PE tile stub (Section</w:t>
+        <w:t xml:space="preserve">The ‘fp32_alu‘ unit deserves particular attention: it provides the division operation that the FMA units lack, and division is essential for normalization layers (layer norm, batch norm, softmax denominator). The ALU implements restoring binary long division with a 28-cycle latency, alongside 3-cycle MIN/MAX/CMP and 4-cycle FMA-path ADD/SUB/MUL. A dedicated ‘fp32_alu_chip‘ wrapper integrates the ALU with the PNM fabric’s AXI-Stream interface: it deserializes 4-byte FP32 operands from the flit byte stream, feeds them to the ALU, and serializes the result back, all while running the CRC half of the doorbell discipline in hardware. This chip is the compute unit that sits behind the PE tile stub (Section</w:t>
       </w:r>
       <w:r>
         <w:t xml:space="preserve"> </w:t>
@@ -12128,10 +12136,7 @@
         <w:t xml:space="preserve">This paper has specified a distributed spatial Processing-Near-Memory architecture that bypasses the HBM capacity wall through three physical properties that no market correction can alter: commodity LPDDR6 CAMM2 modules with no interposer dependency</w:t>
       </w:r>
       <w:r>
-        <w:t xml:space="preserve">, mature-node DUV logic with high yields and established supply chains</w:t>
-      </w:r>
-      <w:r>
-        <w:t xml:space="preserve">, and deterministic wormhole routing that eliminates runtime scheduling overhead</w:t>
+        <w:t xml:space="preserve">, mature-node DUV logic with high yields and established supply chains, and deterministic wormhole routing that eliminates runtime scheduling overhead</w:t>
       </w:r>
       <w:r>
         <w:t xml:space="preserve">. By treating the physical motherboard as an immutable dataflow graph and exporting its topography as a bespoke ISA, the system eliminates cache coherency, operating-system overhead, and the thermal density of advanced interposer stacks. Routing is coordinate arithmetic on a single-spine tree with dimension-order on-board paths; deadlock freedom follows from four monotonically ordered virtual-channel classes with credited per-class buffers at the two state points in the design; the hardened doorbell makes activation atomic, idle-free, and loss-observable through a single ACK wire; and the isothermal parallel manifold sustains thermal viability with enforced flow balance. A RISC-V BMC/router chip at the spine root provides a programmable management plane compatible with Linux and Redox, handling topology discovery, workload dispatch, and host PCIe on a single socketed, cold-swappable die. The reference chassis—64 TB, 131 TB/s aggregate node-local bandwidth, approximately 197 TFLOPS FP64, approximately 15 W per node—demonstrates that the physical constraints of interposer packaging, EUV yield, and thermal density favour distributed commodity memory by a wide margin. At current DRAM prices, the cost advantage is approximately 20</w:t>

</xml_diff>

<commit_message>
Add FP4 and MXFP4 quantized compute units
</commit_message>
<xml_diff>
--- a/paper/submission/paper.docx
+++ b/paper/submission/paper.docx
@@ -10947,7 +10947,7 @@
         <w:pStyle w:val="BodyText"/>
       </w:pPr>
       <w:r>
-        <w:t xml:space="preserve">The MAC array is not a monolithic unit but a collection of specialized compute units, each optimized for a different precision and operation class. The reference node instantiates eight unit types, selected at compile time by the kernel mapper (Section</w:t>
+        <w:t xml:space="preserve">The MAC array is not a monolithic unit but a collection of specialized compute units, each optimized for a different precision and operation class. The reference node instantiates eleven unit types, selected at compile time by the kernel mapper (Section</w:t>
       </w:r>
       <w:r>
         <w:t xml:space="preserve"> </w:t>
@@ -11027,6 +11027,24 @@
       <w:r>
         <w:t xml:space="preserve">int8_mac | INT8 | 2 cycles | Multiply-Accumulate | Quantized inference, INT8 weight-stationary kernels</w:t>
       </w:r>
+      <w:r>
+        <w:t xml:space="preserve"> </w:t>
+      </w:r>
+      <w:r>
+        <w:t xml:space="preserve">int4_mac_array | INT4/INT8 | variable | Systolic MAC array | INT4 quantized inference (4x density vs BF16)</w:t>
+      </w:r>
+      <w:r>
+        <w:t xml:space="preserve"> </w:t>
+      </w:r>
+      <w:r>
+        <w:t xml:space="preserve">fp4_mac_array | FP4 (E2M1) | variable | Systolic MAC array | FP4 quantized inference (4x density vs BF16)</w:t>
+      </w:r>
+      <w:r>
+        <w:t xml:space="preserve"> </w:t>
+      </w:r>
+      <w:r>
+        <w:t xml:space="preserve">mxfp4_mac_array | MXFP4 | variable | Systolic MAC array | MXFP4 block-scaled (OCP microscaling) inference</w:t>
+      </w:r>
     </w:p>
     <w:p>
       <w:pPr>
@@ -11048,6 +11066,31 @@
       </w:hyperlink>
       <w:r>
         <w:t xml:space="preserve">) for layer norm and activation workloads.</w:t>
+      </w:r>
+    </w:p>
+    <w:p>
+      <w:pPr>
+        <w:pStyle w:val="BodyText"/>
+      </w:pPr>
+      <w:r>
+        <w:t xml:space="preserve">The quantized precision spectrum extends the taxonomy down to 4-bit floating point. The ‘fp4_mac_array‘ and ‘mxfp4_mac_array‘ units operate on FP4 (E2M1) values packed two per byte, dequantizing each nibble to fixed point and accumulating to INT32—4x the packing density of BF16, equal to that of INT4, at the cost of reduced input precision. Following the OCP Microscaling convention, MXFP4 additionally carries one shared 8-bit block scale per 32-element block, so a run of weights can recover the exponent range that a bare 4-bit field cannot represent. A 4-bit value is too narrow to multiply directly, so both units follow the same dequantize-then-multiply convention as the INT4 path: the systolic array accumulates fixed-point products in INT32 and the wider accumulator absorbs the reduced input precision, with the block scale folded into the mantissa shift. The ‘weight_dequant‘ unit was extended to the same four modes (INT4, INT8, FP4, MXFP4), and the co-simulation ‘QuantMode‘ offers ‘int4‘, ‘fp4‘, and ‘mxfp4‘ weight-only options alongside the default BF16. These narrower formats are a deployment option for bandwidth-bound weight streaming, not the default: BF16 remains the reference precision, and the closed-form latency bounds of Section</w:t>
+      </w:r>
+      <w:r>
+        <w:t xml:space="preserve"> </w:t>
+      </w:r>
+      <w:hyperlink w:anchor="sec:3.4">
+        <w:r>
+          <w:rPr>
+            <w:rStyle w:val="Hyperlink"/>
+          </w:rPr>
+          <w:t xml:space="preserve">3.4</w:t>
+        </w:r>
+      </w:hyperlink>
+      <w:r>
+        <w:t xml:space="preserve"> </w:t>
+      </w:r>
+      <w:r>
+        <w:t xml:space="preserve">hold for every unit type because the array pipeline depth, not the data width, sets the critical path.</w:t>
       </w:r>
     </w:p>
     <w:p>

</xml_diff>

<commit_message>
Apply cross-repo consistency audit fixes
</commit_message>
<xml_diff>
--- a/paper/submission/paper.docx
+++ b/paper/submission/paper.docx
@@ -2461,7 +2461,7 @@
         </m:r>
       </m:oMath>
       <w:r>
-        <w:t xml:space="preserve">1 s (512 bitmaps at 6 bytes each via sideband), weight upload in approximately 12–15 min (64 TB through the dual PCIe Gen5 x16 uplinks at a realistic sustained fraction of the unidirectional rate), MoE load in</w:t>
+        <w:t xml:space="preserve">1 s (512 node bitmaps at 6 bytes each via sideband), weight upload in approximately 12–15 min (64 TB through the dual PCIe Gen5 x16 uplinks at a realistic sustained fraction of the unidirectional rate), MoE load in</w:t>
       </w:r>
       <w:r>
         <w:t xml:space="preserve"> </w:t>
@@ -6812,7 +6812,7 @@
         <w:pStyle w:val="FirstParagraph"/>
       </w:pPr>
       <w:r>
-        <w:t xml:space="preserve">LPDDR6 provides on-die ECC; the MAC ASIC’s memory controller adds conventional SECDED on the bus. Every fabric link carries a link-local CRC per flit that covers the full flit including its routing header bytes, so a bit error that would corrupt a route decision is detected before the consuming gate strips its header byte; a corrupt flit is discarded at the boundary rather than misrouted. Every message additionally carries an end-to-end CRC per message over the protected body—[CTRL, DEST, LEN, payload]—and the destination DMA refuses the doorbell unless the protected destination matches its own coordinate (Section</w:t>
+        <w:t xml:space="preserve">LPDDR6 provides on-die ECC; the MAC ASIC’s memory controller adds conventional SECDED on the bus. Every message carries an end-to-end CRC-16/CCITT-FALSE check over the protected body—[CTRL, DEST, LEN, payload]—and because the DEST field (MODULE_ID) is inside that coverage, a bit error that would corrupt a route decision is caught when the destination DMA refuses the doorbell (Section</w:t>
       </w:r>
       <w:r>
         <w:t xml:space="preserve"> </w:t>
@@ -6823,6 +6823,20 @@
             <w:rStyle w:val="Hyperlink"/>
           </w:rPr>
           <w:t xml:space="preserve">2.9</w:t>
+        </w:r>
+      </w:hyperlink>
+      <w:r>
+        <w:t xml:space="preserve">); there is no per-link CRC and no mid-fabric discard—a corrupt flit is dropped only at its destination doorbell, and the withheld ACK converts the loss into an observable NODE_ERR (Section</w:t>
+      </w:r>
+      <w:r>
+        <w:t xml:space="preserve"> </w:t>
+      </w:r>
+      <w:hyperlink w:anchor="sec:4.1">
+        <w:r>
+          <w:rPr>
+            <w:rStyle w:val="Hyperlink"/>
+          </w:rPr>
+          <w:t xml:space="preserve">4.1</w:t>
         </w:r>
       </w:hyperlink>
       <w:r>
@@ -7228,7 +7242,21 @@
         <w:pStyle w:val="BodyText"/>
       </w:pPr>
       <w:r>
-        <w:t xml:space="preserve">When a token requires a given expert, the central router chip evaluates the coordinate routing function, dispatches the token via wormhole routing to the holding node, and the doorbell fires. The local MAC executes and returns the updated hidden state. Because only the token travels to the expert—the expert’s weights stay resident—the cross-layer traffic fraction</w:t>
+        <w:t xml:space="preserve">The KV cache store/load/evict cycle is machine-checked end-to-end: KV commands ride the fabric as CRC-protected wormhole flits (CTRL opcodes 0xA0 for store, 0xB0 for load), the offload controller evicts the oldest entry when a bank reaches capacity, and a load returns a CRC-complete response flit the node doorbell accepts (Section</w:t>
+      </w:r>
+      <w:r>
+        <w:t xml:space="preserve"> </w:t>
+      </w:r>
+      <w:hyperlink w:anchor="sec:2.15">
+        <w:r>
+          <w:rPr>
+            <w:rStyle w:val="Hyperlink"/>
+          </w:rPr>
+          <w:t xml:space="preserve">2.15</w:t>
+        </w:r>
+      </w:hyperlink>
+      <w:r>
+        <w:t xml:space="preserve">). When a token requires a given expert, the central router chip evaluates the coordinate routing function, dispatches the token via wormhole routing to the holding node, and the doorbell fires. The local MAC executes and returns the updated hidden state. Because only the token travels to the expert—the expert’s weights stay resident—the cross-layer traffic fraction</w:t>
       </w:r>
       <w:r>
         <w:t xml:space="preserve"> </w:t>
@@ -7881,7 +7909,21 @@
         </w:r>
       </w:hyperlink>
       <w:r>
-        <w:t xml:space="preserve">.</w:t>
+        <w:t xml:space="preserve">. Two opt-in KV scenarios exercise the cache banks of Section</w:t>
+      </w:r>
+      <w:r>
+        <w:t xml:space="preserve"> </w:t>
+      </w:r>
+      <w:hyperlink w:anchor="sec:2.12">
+        <w:r>
+          <w:rPr>
+            <w:rStyle w:val="Hyperlink"/>
+          </w:rPr>
+          <w:t xml:space="preserve">2.12</w:t>
+        </w:r>
+      </w:hyperlink>
+      <w:r>
+        <w:t xml:space="preserve">: kv stores CRC-validated entries into the per-column banks and loads them back as CRC-complete compute flits the node doorbell accepts (corrupt commands are drained and refused), and kvflow drives a small bank through fill, automatic eviction by the offload controller at capacity, and reload, machine-checking the circular FIFO window against a software twin that replays the same command sequence with the same eviction rule.</w:t>
       </w:r>
     </w:p>
     <w:p>
@@ -9461,7 +9503,7 @@
         </m:r>
       </m:oMath>
       <w:r>
-        <w:t xml:space="preserve">8 chassis emits three artifacts: a routing table of exactly 512 entries—one 11-bit bitmap per repeater and node, loaded during POST; an expert map placing all experts of every model layer across the expert-parallel node pool with no data-parallel replication waste; and a per-token dispatch plan. For the Gemma-4-class reference model fixture (30 layers, 128 experts, top-8), the plan is 270 dispatches per token: 30 dense attention projections plus 240 expert activations, each carrying its destination coordinate, compute-unit assignment, KV-cache disposition, and flit byte count. The firmware boot sequence is verified against the same artifacts: five phases (POST discovery finding all 512 nodes, routing-table load of 512 bitmaps, weight upload of 8,045 integrity-checked commands, MoE gating load of 3,840 expert mappings—128 experts</w:t>
+        <w:t xml:space="preserve">8 chassis emits three artifacts: a routing table of exactly 512 entries—one 11-bit bitmap per node (the per-layer repeater bitmaps ride the same table), loaded during POST; an expert map placing all experts of every model layer across the expert-parallel node pool with no data-parallel replication waste; and a per-token dispatch plan. For the Gemma-4-class reference model fixture (30 layers, 128 experts, top-8), the plan is 270 dispatches per token: 30 dense attention projections plus 240 expert activations, each carrying its destination coordinate, compute-unit assignment, KV-cache disposition, and flit byte count. The firmware boot sequence is verified against the same artifacts: five phases (POST discovery finding all 512 nodes, routing-table load of 512 bitmaps, weight upload of 8,045 integrity-checked commands, MoE gating load of 3,840 expert mappings—128 experts</w:t>
       </w:r>
       <w:r>
         <w:t xml:space="preserve"> </w:t>
@@ -11178,7 +11220,7 @@
         </m:r>
       </m:oMath>
       <w:r>
-        <w:t xml:space="preserve">16 GB/s per direction; wormhole framing, link-local CRC per flit</w:t>
+        <w:t xml:space="preserve">16 GB/s per direction; wormhole framing, end-to-end CRC per message</w:t>
       </w:r>
       <w:r>
         <w:t xml:space="preserve"> </w:t>
@@ -12805,7 +12847,7 @@
         <w:pStyle w:val="BodyText"/>
       </w:pPr>
       <w:r>
-        <w:t xml:space="preserve">Reliability claims and their validation scope. The only integrity mechanisms the co-simulation actually exercises are the end-to-end CRC-16/CCITT-FALSE check of Section</w:t>
+        <w:t xml:space="preserve">Reliability claims and their validation scope. The only integrity mechanism the co-simulation actually exercises is the end-to-end CRC-16/CCITT-FALSE check of Sections</w:t>
       </w:r>
       <w:r>
         <w:t xml:space="preserve"> </w:t>
@@ -12822,7 +12864,7 @@
         <w:t xml:space="preserve"> </w:t>
       </w:r>
       <w:r>
-        <w:t xml:space="preserve">and the link-local CRC of Section</w:t>
+        <w:t xml:space="preserve">and</w:t>
       </w:r>
       <w:r>
         <w:t xml:space="preserve"> </w:t>

</xml_diff>

<commit_message>
paper: drop the security-posture paragraph from Section 4.6
The section is now 'Design-for-test and manufacturing readiness': the
security model (secure boot, privilege separation, debug lockdown, sideband
integrity) is not a claim this design makes at this point, and the RTL does
not implement a hash-verified boot chain, PMP enforcement, a JTAG lock state
or a signed debug challenge. The seL4 reference (ref 9) stays cited in
Sections 1.2, 2.1 and 4.4, so the bibliography is unchanged.
</commit_message>
<xml_diff>
--- a/paper/submission/paper.docx
+++ b/paper/submission/paper.docx
@@ -23,7 +23,7 @@
         <w:pStyle w:val="Date"/>
       </w:pPr>
       <w:r>
-        <w:t xml:space="preserve">October 18, 2026</w:t>
+        <w:t xml:space="preserve">October 20, 2026</w:t>
       </w:r>
     </w:p>
     <w:bookmarkStart w:id="20" w:name="sec:abstract"/>
@@ -16981,79 +16981,12 @@
         <w:pStyle w:val="Heading2"/>
       </w:pPr>
       <w:r>
-        <w:t xml:space="preserve">4.6 Security posture, design-for-test, and manufacturing readiness</w:t>
+        <w:t xml:space="preserve">4.6 Design-for-test and manufacturing readiness</w:t>
       </w:r>
     </w:p>
     <w:p>
       <w:pPr>
         <w:pStyle w:val="FirstParagraph"/>
-      </w:pPr>
-      <w:r>
-        <w:t xml:space="preserve">The security model follows from the same property that makes the fabric verifiable: state lives in exactly one place. Compute nodes hold no secrets and no mutable control state—their only configuration is the POST-loaded routing bitmap and kernel constants—so there is nothing on a node to escalate against, and the lxy_repeater’s hardwired bitmask barrier (Section</w:t>
-      </w:r>
-      <w:r>
-        <w:t xml:space="preserve"> </w:t>
-      </w:r>
-      <w:hyperlink w:anchor="sec:2.1">
-        <w:r>
-          <w:rPr>
-            <w:rStyle w:val="Hyperlink"/>
-          </w:rPr>
-          <w:t xml:space="preserve">2.1</w:t>
-        </w:r>
-      </w:hyperlink>
-      <w:r>
-        <w:t xml:space="preserve">) doubles as a hardware isolation boundary no firmware can reconfigure because no such register exists</w:t>
-      </w:r>
-      <w:r>
-        <w:t xml:space="preserve">. The attack surface concentrates on the router chip, which the RTL addresses at four layers. First, secure boot: the 64 KB boot ROM is mask-programmed (combinational, unwritable by construction), and the firmware image it chains to is hash-verified before the CLINT timer or PNM window is released to user code. Second, privilege separation: the RV32 core implements machine-mode CSRs plus physical memory protection (PMP), and the seL4 deployment option (Section</w:t>
-      </w:r>
-      <w:r>
-        <w:t xml:space="preserve"> </w:t>
-      </w:r>
-      <w:hyperlink w:anchor="sec:2.17">
-        <w:r>
-          <w:rPr>
-            <w:rStyle w:val="Hyperlink"/>
-          </w:rPr>
-          <w:t xml:space="preserve">2.17</w:t>
-        </w:r>
-      </w:hyperlink>
-      <w:r>
-        <w:t xml:space="preserve">) replaces the monolithic kernel with a formally verified microkernel whose capability system mediates every device-frame mapping—the root task cannot touch UART or PNM registers without an explicit capability grant. Third, debug lockdown: the JTAG TAP present for bring-up fuses into a locked state at production, with re-entry requiring a signed challenge over the host PCIe link. Fourth, sideband integrity: NODE_ERR and TOPOLOGY_RDY travel on physically separate wires (Section</w:t>
-      </w:r>
-      <w:r>
-        <w:t xml:space="preserve"> </w:t>
-      </w:r>
-      <w:hyperlink w:anchor="sec:2.4">
-        <w:r>
-          <w:rPr>
-            <w:rStyle w:val="Hyperlink"/>
-          </w:rPr>
-          <w:t xml:space="preserve">2.4</w:t>
-        </w:r>
-      </w:hyperlink>
-      <w:r>
-        <w:t xml:space="preserve">) that no data-path fault can mask, so fault injection on the NoB cannot silence the error channel that Section</w:t>
-      </w:r>
-      <w:r>
-        <w:t xml:space="preserve"> </w:t>
-      </w:r>
-      <w:hyperlink w:anchor="sec:4.1">
-        <w:r>
-          <w:rPr>
-            <w:rStyle w:val="Hyperlink"/>
-          </w:rPr>
-          <w:t xml:space="preserve">4.1</w:t>
-        </w:r>
-      </w:hyperlink>
-      <w:r>
-        <w:t xml:space="preserve">’s recovery protocol depends on.</w:t>
-      </w:r>
-    </w:p>
-    <w:p>
-      <w:pPr>
-        <w:pStyle w:val="BodyText"/>
       </w:pPr>
       <w:r>
         <w:t xml:space="preserve">Design-for-test follows the same concentration principle. Both dies carry a JTAG TAP; the router SoC adds a scan-mode override on its clock-gating cells (the latch-based gate passes the test clock unconditionally when scan_en asserts, so gated domains remain observable during scan shift), and every asynchronous reset crossing passes through a two-flop synchronizer (rst_sync.v) so reset-domain crossings are scan-compatible rather than metastability hazards. On-chip memories—router SRAM, node elastic buffers—are reached by a bounded MBIST sequence run from ROM before POST Phase 1, so a bad SRAM word never reaches the topology inventory. The PHY blocks self-test through loopback: the PCIe endpoint’s LOOPBACK parameter drives LTSSM through lane bring-up with no external partner, and the optical links’ CRC-on-arrival check (Section</w:t>

</xml_diff>

<commit_message>
paper: scope the Linux/seL4 claims to what the RTL actually does
Section 2.17 now says that the OS images ship and build, but do not yet
boot on the proof-of-concept core (which does not implement the JAL/JALR
link store), and that the gap is machine-checked by the init-on-core
testbench rather than assumed. The Conclusion's 'compatible with' becomes
'targeting'.
</commit_message>
<xml_diff>
--- a/paper/submission/paper.docx
+++ b/paper/submission/paper.docx
@@ -9437,7 +9437,7 @@
         <w:pStyle w:val="BodyText"/>
       </w:pPr>
       <w:r>
-        <w:t xml:space="preserve">The current RTL implements the RV32IMA baseline as a proof of concept; production silicon upgrades to RV32IMAFC (adding compressed instructions and single/double-precision floating point) to meet the NOMMU Linux requirement. The C firmware port targets both deployment modes: bare-metal static allocation for deterministic boot-time behavior, and a NOMMU Linux userspace daemon for operational flexibility.</w:t>
+        <w:t xml:space="preserve">The current RTL implements the RV32IMA baseline as a proof of concept; production silicon upgrades to RV32IMAFC (adding compressed instructions and single/double-precision floating point) to meet the NOMMU Linux requirement. The OS images themselves are in the repository (a trimmed NOMMU Linux with a bare-metal init, and a seL4 root task), and they build; they do not yet boot on the proof-of-concept core, which does not implement the JAL/JALR link store, so no compiler-generated code runs on it yet. That gap is machine-checked rather than assumed: a testbench executes the Linux init binary on the chip’s own core and UART models (HDL/tb_linux_init.v) and checks its boot banner. The C firmware port targets both deployment modes: bare-metal static allocation for deterministic boot-time behavior, and a NOMMU Linux userspace daemon for operational flexibility.</w:t>
       </w:r>
     </w:p>
     <w:p>
@@ -17028,7 +17028,7 @@
         <w:t xml:space="preserve">, mature-node DUV logic with high yields and established supply chains, and deterministic wormhole routing that eliminates runtime scheduling overhead</w:t>
       </w:r>
       <w:r>
-        <w:t xml:space="preserve">. By treating the physical motherboard as an immutable dataflow graph and exporting its topography as a bespoke ISA, the system eliminates cache coherency, operating-system overhead, and the thermal density of advanced interposer stacks. Routing is coordinate arithmetic on a single-spine tree with dimension-order on-board paths; deadlock freedom follows from four monotonically ordered virtual-channel classes with credited per-class buffers at the two state points in the design; the hardened doorbell makes activation atomic, idle-free, and loss-observable through a single ACK wire; and the isothermal parallel manifold sustains thermal viability with enforced flow balance. A RISC-V BMC/router chip at the spine root provides a programmable management plane compatible with Linux and seL4, handling topology discovery, workload dispatch, and host PCIe on a single socketed, cold-swappable die.</w:t>
+        <w:t xml:space="preserve">. By treating the physical motherboard as an immutable dataflow graph and exporting its topography as a bespoke ISA, the system eliminates cache coherency, operating-system overhead, and the thermal density of advanced interposer stacks. Routing is coordinate arithmetic on a single-spine tree with dimension-order on-board paths; deadlock freedom follows from four monotonically ordered virtual-channel classes with credited per-class buffers at the two state points in the design; the hardened doorbell makes activation atomic, idle-free, and loss-observable through a single ACK wire; and the isothermal parallel manifold sustains thermal viability with enforced flow balance. A RISC-V BMC/router chip at the spine root provides a programmable management plane targeting Linux and seL4, handling topology discovery, workload dispatch, and host PCIe on a single socketed, cold-swappable die.</w:t>
       </w:r>
     </w:p>
     <w:p>

</xml_diff>

<commit_message>
paper: record the fabric's tree structure and the end-to-end check
Section 2.17.1 now states the structural fact the transport-plane test
made explicit: the fabric is a tree whose only router is the root, so a
node's dispatch reaches the expert either through the host (mode B) or
through a root-side router that consumes the decision directly (the mode-A
path).  What mode A keeps local is the decision, not the dispatch -- the
dispatch crosses the fabric because the expert's weights are what it is
for.  The end-to-end path is machine-checked as one composed system.
</commit_message>
<xml_diff>
--- a/paper/submission/paper.docx
+++ b/paper/submission/paper.docx
@@ -9671,6 +9671,14 @@
       </w:hyperlink>
       <w:r>
         <w:t xml:space="preserve">), that per-token management traffic is under ten percent: the honest case for mode A is architectural rather than bandwidth-critical—the decision is made and acted on where the token already is, so it never becomes fabric traffic at all, and the node does not depend on the host to route it.</w:t>
+      </w:r>
+    </w:p>
+    <w:p>
+      <w:pPr>
+        <w:pStyle w:val="BodyText"/>
+      </w:pPr>
+      <w:r>
+        <w:t xml:space="preserve">One structural fact bounds both modes, and it is a property of the fabric rather than of the manager. The fabric is a tree whose only router is the root: a node’s message travels up the spine and is re-issued downward from the top. A dispatch therefore reaches the expert node either through the host, which reads the decision and injects the dispatch (mode B), or through a root-side router that consumes the decision directly and injects the dispatch without the host (the mode-A path). The *decision* is what mode A keeps local; the dispatch itself still crosses the fabric, because the expert’s weights are what the dispatch is for. The end-to-end path—host to the management node, the gating engine, the dispatch, the expert, and the result back—is machine-checked as one composed system.</w:t>
       </w:r>
     </w:p>
     <w:bookmarkEnd w:id="58"/>

</xml_diff>